<commit_message>
Communication centrée sur le parcours de Guinée Impact et la distinction au YES Africa Summit 2025
Co-Authored-By: Claude Opus 5.5 <noreply@anthropic.com>
Claude-Session: https://claude.ai/code/session_01Y44voEEgrqkDtN5faKYhcF
</commit_message>
<xml_diff>
--- a/Communication_Guinee_Impact_Forum_Dakar_2026.docx
+++ b/Communication_Guinee_Impact_Forum_Dakar_2026.docx
@@ -27,7 +27,7 @@
         <w:rPr>
           <w:b/>
         </w:rPr>
-        <w:t>Organisation membre du Groupe de Travail Femmes, Jeunes, Paix et Sécurité en Afrique de l’Ouest et au Sahel – Guinée (GTFJPS-AOS/GN)</w:t>
+        <w:t>De Somone à Dakar : le parcours de Guinée Impact pour la paix et la participation des femmes et des jeunes</w:t>
         <w:br/>
       </w:r>
       <w:r>
@@ -64,34 +64,6 @@
               <w:rPr>
                 <w:b/>
               </w:rPr>
-              <w:t>Titre proposé</w:t>
-            </w:r>
-          </w:p>
-        </w:tc>
-        <w:tc>
-          <w:tcPr>
-            <w:tcW w:type="dxa" w:w="4320"/>
-          </w:tcPr>
-          <w:p>
-            <w:r>
-              <w:rPr>
-                <w:b/>
-              </w:rPr>
-              <w:t>« Porter la paix jusqu’aux communautés : l’expérience de Guinée Impact à Mamou »</w:t>
-            </w:r>
-          </w:p>
-        </w:tc>
-      </w:tr>
-      <w:tr>
-        <w:tc>
-          <w:tcPr>
-            <w:tcW w:type="dxa" w:w="4320"/>
-          </w:tcPr>
-          <w:p>
-            <w:r>
-              <w:rPr>
-                <w:b/>
-              </w:rPr>
               <w:t>Orateur</w:t>
             </w:r>
           </w:p>
@@ -108,13 +80,32 @@
               <w:t>Mamadou BARRY</w:t>
             </w:r>
             <w:r>
-              <w:t xml:space="preserve"> , </w:t>
+              <w:t xml:space="preserve"> , Président de Guinée Impact</w:t>
             </w:r>
+          </w:p>
+        </w:tc>
+      </w:tr>
+      <w:tr>
+        <w:tc>
+          <w:tcPr>
+            <w:tcW w:type="dxa" w:w="4320"/>
+          </w:tcPr>
+          <w:p>
             <w:r>
-              <w:t>[fonction]</w:t>
+              <w:rPr>
+                <w:b/>
+              </w:rPr>
+              <w:t>Organisation</w:t>
             </w:r>
+          </w:p>
+        </w:tc>
+        <w:tc>
+          <w:tcPr>
+            <w:tcW w:type="dxa" w:w="4320"/>
+          </w:tcPr>
+          <w:p>
             <w:r>
-              <w:t xml:space="preserve"> , Guinée Impact</w:t>
+              <w:t>Guinée Impact, organisation membre du Groupe de Travail Femmes, Jeunes, Paix et Sécurité en Afrique de l’Ouest et au Sahel – Guinée (GTFJPS-AOS/GN)</w:t>
             </w:r>
           </w:p>
         </w:tc>
@@ -154,7 +145,7 @@
               <w:rPr>
                 <w:b/>
               </w:rPr>
-              <w:t>Pilier du forum</w:t>
+              <w:t>Objectif</w:t>
             </w:r>
           </w:p>
         </w:tc>
@@ -164,7 +155,16 @@
           </w:tcPr>
           <w:p>
             <w:r>
-              <w:t>Participation (partage de bonnes pratiques), avec un lien vers le Plaidoyer</w:t>
+              <w:t xml:space="preserve">Présenter ce que Guinée Impact a accompli depuis la 1 </w:t>
+            </w:r>
+            <w:r>
+              <w:rPr>
+                <w:vertAlign w:val="superscript"/>
+              </w:rPr>
+              <w:t>re</w:t>
+            </w:r>
+            <w:r>
+              <w:t xml:space="preserve"> édition à Somone, avec ses équipes et ses partenaires, et la distinction reçue au Youth Empowerment Summit – YES Africa 2025, à Marrakech</w:t>
             </w:r>
           </w:p>
         </w:tc>
@@ -189,7 +189,7 @@
           </w:tcPr>
           <w:p>
             <w:r>
-              <w:t>Rapport d’activités de Guinée Impact à Mamou (16 au 20 janvier 2025) ; rapport annuel 2024 du GTFJPS-AOS/GN ; stratégie d’action validée à Somone</w:t>
+              <w:t>Rapport d’activités de Guinée Impact à Mamou (janvier 2025) ; rapport annuel 2024 du GTFJPS-AOS/GN ; stratégie d’action validée à Somone ; informations fournies par Mamadou BARRY ; sources publiques sur le YES Africa Summit (voir section 3)</w:t>
             </w:r>
           </w:p>
         </w:tc>
@@ -204,10 +204,59 @@
         <w:rPr>
           <w:b/>
         </w:rPr>
-        <w:t>À compléter avant de présenter :</w:t>
+        <w:t>À compléter (en rouge dans le texte) :</w:t>
       </w:r>
       <w:r>
-        <w:t xml:space="preserve"> votre fonction, une courte présentation de Guinée Impact (année de création, mission, zones d’intervention) et, si possible, les activités menées depuis janvier 2025. Les photos de Mamou citées dans le rapport feront de très bonnes diapositives.</w:t>
+        <w:t xml:space="preserve"> année de création et mission de Guinée Impact ; </w:t>
+      </w:r>
+      <w:r>
+        <w:rPr>
+          <w:b/>
+        </w:rPr>
+        <w:t>nom exact de la distinction</w:t>
+      </w:r>
+      <w:r>
+        <w:t xml:space="preserve"> reçue au YES Africa Summit et son motif ; autres activités menées depuis Somone. Les informations sur le sommet viennent de sources publiques (section 3). En revanche, je n’ai trouvé aucune source publique sur la distinction de Guinée Impact : son nom et son motif doivent venir de vous.</w:t>
+      </w:r>
+      <w:r/>
+    </w:p>
+    <w:p>
+      <w:r/>
+      <w:r>
+        <w:rPr>
+          <w:b/>
+        </w:rPr>
+        <w:t>Conseil de ton :</w:t>
+      </w:r>
+      <w:r>
+        <w:t xml:space="preserve"> vous présentez un parcours personnel devant un forum de jeunes </w:t>
+      </w:r>
+      <w:r>
+        <w:rPr>
+          <w:b/>
+        </w:rPr>
+        <w:t>féministes</w:t>
+      </w:r>
+      <w:r>
+        <w:t xml:space="preserve">. Le message sera d’autant mieux reçu que la réussite est présentée comme </w:t>
+      </w:r>
+      <w:r>
+        <w:rPr>
+          <w:b/>
+        </w:rPr>
+        <w:t>collective</w:t>
+      </w:r>
+      <w:r>
+        <w:t xml:space="preserve"> et </w:t>
+      </w:r>
+      <w:r>
+        <w:rPr>
+          <w:b/>
+        </w:rPr>
+        <w:t>au service des femmes et des jeunes</w:t>
+      </w:r>
+      <w:r>
+        <w:t>. Le texte met donc en avant les équipes, les femmes leaders de Mamou et les jeunes. Si possible, invitez une femme de votre équipe à prendre la parole 30 secondes, ou citez son témoignage.</w:t>
       </w:r>
       <w:r/>
     </w:p>
@@ -248,10 +297,10 @@
         <w:rPr>
           <w:b/>
         </w:rPr>
-        <w:t>Un plaidoyer ne vaut que s’il arrive jusqu’aux communautés.</w:t>
+        <w:t>Depuis Somone, Guinée Impact a transformé les engagements en actions</w:t>
       </w:r>
       <w:r>
-        <w:t xml:space="preserve"> À Mamou, Guinée Impact a porté la stratégie nationale de plaidoyer sur la participation des filles et des femmes jusqu’aux familles, aux lieux de culte et aux jeunes.</w:t>
+        <w:t>, jusque dans les communautés, comme à Mamou en janvier 2025.</w:t>
       </w:r>
       <w:r/>
     </w:p>
@@ -266,10 +315,10 @@
         <w:rPr>
           <w:b/>
         </w:rPr>
-        <w:t>Il faut parler la langue des communautés.</w:t>
+        <w:t>Une reconnaissance internationale, fruit d’un travail d’équipe.</w:t>
       </w:r>
       <w:r>
-        <w:t xml:space="preserve"> Radio, théâtre en langue locale, dialogue avec les leaders religieux : c’est ce qui a permis de lever les résistances, notamment sur les MGF.</w:t>
+        <w:t xml:space="preserve"> La distinction reçue au Youth Empowerment Summit – YES Africa 2025, à Marrakech, parmi 118 ONG de 43 pays africains, appartient aux équipes, aux partenaires et aux femmes et jeunes avec qui nous travaillons.</w:t>
       </w:r>
       <w:r/>
     </w:p>
@@ -284,10 +333,10 @@
         <w:rPr>
           <w:b/>
         </w:rPr>
-        <w:t>La paix se construit entre générations.</w:t>
+        <w:t>Ce que nous avons appris peut servir à toute la région</w:t>
       </w:r>
       <w:r>
-        <w:t xml:space="preserve"> Les espaces de dialogue entre femmes leaders et jeunes transmettent l’expérience et font émerger la relève.</w:t>
+        <w:t xml:space="preserve"> : parler la langue des communautés, associer les leaders religieux, faire dialoguer les générations.</w:t>
       </w:r>
       <w:r/>
       <w:r/>
@@ -331,13 +380,7 @@
     <w:p>
       <w:r/>
       <w:r>
-        <w:t xml:space="preserve">Je m’appelle Mamadou BARRY, </w:t>
-      </w:r>
-      <w:r>
-        <w:t>[fonction]</w:t>
-      </w:r>
-      <w:r>
-        <w:t xml:space="preserve"> à </w:t>
+        <w:t xml:space="preserve">Je m’appelle Mamadou BARRY, Président de </w:t>
       </w:r>
       <w:r>
         <w:rPr>
@@ -353,14 +396,14 @@
     <w:p>
       <w:r/>
       <w:r>
-        <w:t>À Somone, nous nous étions engagé·es à nous approprier et à faire connaître les lois et les politiques sur les droits des femmes et l’agenda Jeunes, Paix et Sécurité, et à renforcer nos stratégies de plaidoyer. Je viens vous raconter comment nous avons essayé de tenir cet engagement, là où il compte le plus : dans les communautés.</w:t>
+        <w:t>À Somone, lors de la première édition de ce forum, nous avons pris des engagements ensemble. Je suis venu à Dakar vous rendre compte de ce que Guinée Impact en a fait. Et je veux le dire d’emblée : rien de ce que je vais présenter n’aurait été possible sans nos équipes, nos collaborateur·rices, notre Directeur Exécutif, M. Racine Diallo, et surtout les femmes et les jeunes avec qui nous travaillons sur le terrain.</w:t>
       </w:r>
       <w:r/>
     </w:p>
     <w:p>
       <w:r/>
       <w:r>
-        <w:t>Qui nous sommes (30 secondes)</w:t>
+        <w:t>Guinée Impact en bref (1 minute)</w:t>
       </w:r>
       <w:r/>
     </w:p>
@@ -370,10 +413,17 @@
         <w:t xml:space="preserve">Guinée Impact est </w:t>
       </w:r>
       <w:r>
-        <w:t>[présentation en une ou deux phrases : année de création, mission, zones d’intervention]</w:t>
+        <w:t>[année de création, mission, zones d’intervention, en une ou deux phrases]</w:t>
       </w:r>
       <w:r>
-        <w:t xml:space="preserve">. Nous sommes partenaire du projet </w:t>
+        <w:t>.</w:t>
+      </w:r>
+      <w:r/>
+    </w:p>
+    <w:p>
+      <w:r/>
+      <w:r>
+        <w:t xml:space="preserve">Nous sommes membre du Groupe de Travail Femmes, Jeunes, Paix et Sécurité, et partenaire du projet </w:t>
       </w:r>
       <w:r>
         <w:rPr>
@@ -389,44 +439,114 @@
     <w:p>
       <w:r/>
       <w:r>
-        <w:t>Le point de départ : une stratégie nationale (1 minute)</w:t>
+        <w:t>De Somone à Dakar : notre parcours (1 minute)</w:t>
       </w:r>
       <w:r/>
     </w:p>
     <w:p>
       <w:r/>
       <w:r>
-        <w:t xml:space="preserve">En 2024, notre Groupe de Travail et ses partenaires ont élaboré une </w:t>
+        <w:t>En quelques dates :</w:t>
       </w:r>
+      <w:r/>
+      <w:r/>
+    </w:p>
+    <w:p>
+      <w:pPr>
+        <w:pStyle w:val="ListBullet"/>
+        <w:spacing w:line="240" w:lineRule="auto"/>
+        <w:ind w:left="720"/>
+      </w:pPr>
+      <w:r/>
       <w:r>
         <w:rPr>
           <w:b/>
         </w:rPr>
-        <w:t>stratégie nationale de plaidoyer</w:t>
+        <w:t>Somone</w:t>
       </w:r>
       <w:r>
-        <w:t xml:space="preserve"> pour la participation des filles et des femmes à la prévention, à la gestion et à la résolution des conflits. Elle a été construite à partir des plans locaux de 11 zones du pays.</w:t>
+        <w:t xml:space="preserve"> : avec les autres pays de notre groupe, nous nous engageons à faire connaître les lois et politiques sur les droits des femmes et l’agenda Jeunes, Paix et Sécurité, et à renforcer notre plaidoyer.</w:t>
+      </w:r>
+      <w:r/>
+    </w:p>
+    <w:p>
+      <w:pPr>
+        <w:pStyle w:val="ListBullet"/>
+        <w:spacing w:line="240" w:lineRule="auto"/>
+        <w:ind w:left="720"/>
+      </w:pPr>
+      <w:r/>
+      <w:r>
+        <w:rPr>
+          <w:b/>
+        </w:rPr>
+        <w:t>Janvier 2025, Mamou</w:t>
+      </w:r>
+      <w:r>
+        <w:t xml:space="preserve"> : nous portons la stratégie nationale de plaidoyer sur la participation des filles et des femmes jusqu’aux communautés.</w:t>
+      </w:r>
+      <w:r/>
+    </w:p>
+    <w:p>
+      <w:pPr>
+        <w:pStyle w:val="ListBullet"/>
+        <w:spacing w:line="240" w:lineRule="auto"/>
+        <w:ind w:left="720"/>
+      </w:pPr>
+      <w:r/>
+      <w:r>
+        <w:t>[Autres activités menées depuis Somone : date, lieu, résultat]</w:t>
+      </w:r>
+      <w:r/>
+    </w:p>
+    <w:p>
+      <w:pPr>
+        <w:pStyle w:val="ListBullet"/>
+        <w:spacing w:line="240" w:lineRule="auto"/>
+        <w:ind w:left="720"/>
+      </w:pPr>
+      <w:r/>
+      <w:r>
+        <w:rPr>
+          <w:b/>
+        </w:rPr>
+        <w:t>19 et 20 juin 2025, Marrakech</w:t>
+      </w:r>
+      <w:r>
+        <w:t xml:space="preserve"> : Guinée Impact est distinguée au premier Youth Empowerment Summit – YES Africa.</w:t>
+      </w:r>
+      <w:r/>
+    </w:p>
+    <w:p>
+      <w:pPr>
+        <w:pStyle w:val="ListBullet"/>
+        <w:spacing w:line="240" w:lineRule="auto"/>
+        <w:ind w:left="720"/>
+      </w:pPr>
+      <w:r/>
+      <w:r>
+        <w:rPr>
+          <w:b/>
+        </w:rPr>
+        <w:t>Aujourd’hui, Dakar</w:t>
+      </w:r>
+      <w:r>
+        <w:t xml:space="preserve"> : nous venons partager nos leçons avec vous.</w:t>
+      </w:r>
+      <w:r/>
+      <w:r/>
+    </w:p>
+    <w:p>
+      <w:r/>
+      <w:r>
+        <w:t>Mamou : cinq jours, cinq façons de parler aux communautés (2 minutes 30)</w:t>
       </w:r>
       <w:r/>
     </w:p>
     <w:p>
       <w:r/>
       <w:r>
-        <w:t>Mais une stratégie, aussi bonne soit-elle, ne change rien si elle reste dans un bureau à Conakry. Notre rôle, comme organisation membre, était de la porter jusqu’aux communautés.</w:t>
-      </w:r>
-      <w:r/>
-    </w:p>
-    <w:p>
-      <w:r/>
-      <w:r>
-        <w:t>Mamou : cinq jours, cinq façons de parler aux communautés (3 minutes)</w:t>
-      </w:r>
-      <w:r/>
-    </w:p>
-    <w:p>
-      <w:r/>
-      <w:r>
-        <w:t>Du 16 au 20 janvier 2025, à Mamou, nous avons choisi de ne pas faire un seul atelier, mais d’utiliser cinq formats différents, pour toucher des publics différents :</w:t>
+        <w:t>En 2024, notre Groupe de Travail et ses partenaires ont élaboré une stratégie nationale de plaidoyer pour la participation des filles et des femmes à la prévention et à la résolution des conflits. Mais une stratégie ne change rien si elle reste dans un bureau. Du 16 au 20 janvier 2025, à Mamou, nos équipes l’ont portée jusqu’aux communautés, avec cinq formats différents :</w:t>
       </w:r>
       <w:r/>
       <w:r/>
@@ -445,7 +565,7 @@
         <w:t>La radio</w:t>
       </w:r>
       <w:r>
-        <w:t xml:space="preserve"> : une émission interactive de deux heures, en direct, avec des femmes leaders, des organisations de la société civile et de jeunes activistes, pour expliquer la stratégie nationale de plaidoyer au plus grand nombre.</w:t>
+        <w:t xml:space="preserve"> : une émission interactive de deux heures, en direct, avec des femmes leaders, des organisations de la société civile et de jeunes activistes.</w:t>
       </w:r>
       <w:r/>
     </w:p>
@@ -463,7 +583,7 @@
         <w:t>La table ronde</w:t>
       </w:r>
       <w:r>
-        <w:t xml:space="preserve"> : 30 femmes leaders, jeunes et membres d’organisations de la société civile ont analysé les obstacles structurels et culturels à la participation des femmes, et proposé des stratégies pour les surmonter.</w:t>
+        <w:t xml:space="preserve"> : 30 femmes leaders, jeunes et membres d’organisations de la société civile ont analysé les obstacles à la participation des femmes et proposé des solutions.</w:t>
       </w:r>
       <w:r/>
     </w:p>
@@ -481,7 +601,7 @@
         <w:t>Le lieu de culte</w:t>
       </w:r>
       <w:r>
-        <w:t xml:space="preserve"> : un dialogue communautaire avec 50 personnes, mené avec les leaders religieux et communautaires, sur les résolutions 1325 et 2250 et sur les mutilations génitales féminines.</w:t>
+        <w:t xml:space="preserve"> : un dialogue communautaire de 50 personnes, mené avec les leaders religieux et communautaires, sur les résolutions 1325 et 2250 et sur les mutilations génitales féminines.</w:t>
       </w:r>
       <w:r/>
     </w:p>
@@ -499,7 +619,7 @@
         <w:t>La scène</w:t>
       </w:r>
       <w:r>
-        <w:t xml:space="preserve"> : une soirée culturelle au centre culturel de Mamou, avec du théâtre en langue locale, devant plus de 100 personnes.</w:t>
+        <w:t xml:space="preserve"> : une soirée culturelle avec du théâtre en langue locale, devant plus de 100 personnes.</w:t>
       </w:r>
       <w:r/>
     </w:p>
@@ -517,9 +637,52 @@
         <w:t>Le cercle intergénérationnel</w:t>
       </w:r>
       <w:r>
-        <w:t xml:space="preserve"> : deux espaces de dialogue entre femmes leaders et jeunes, pour partager expériences et bonnes pratiques, et préparer les jeunes à se positionner dans les instances de décision.</w:t>
+        <w:t xml:space="preserve"> : deux espaces de dialogue entre femmes leaders et jeunes.</w:t>
       </w:r>
       <w:r/>
+      <w:r/>
+    </w:p>
+    <w:p>
+      <w:r/>
+      <w:r>
+        <w:t>Au total, plus de 180 personnes réunies en cinq jours, sans compter les auditeur·rices de la radio.</w:t>
+      </w:r>
+      <w:r/>
+    </w:p>
+    <w:p>
+      <w:r/>
+      <w:r>
+        <w:t>Une reconnaissance internationale (1 minute)</w:t>
+      </w:r>
+      <w:r/>
+    </w:p>
+    <w:p>
+      <w:r/>
+      <w:r>
+        <w:t xml:space="preserve">Les 19 et 20 juin 2025, à Marrakech, s’est tenu le premier </w:t>
+      </w:r>
+      <w:r>
+        <w:rPr>
+          <w:b/>
+        </w:rPr>
+        <w:t>Youth Empowerment Summit – YES Africa</w:t>
+      </w:r>
+      <w:r>
+        <w:t xml:space="preserve">, co-organisé par la Fondation Jadara et l’Union Panafricaine de la Jeunesse. Plus de 1 000 jeunes leaders et représentant·es de 118 ONG de 43 pays africains y ont travaillé sur l’avenir de la jeunesse africaine, en particulier des jeunes sans emploi, hors de l’école ou sans formation. C’est dans ce cadre que Guinée Impact a reçu </w:t>
+      </w:r>
+      <w:r>
+        <w:t>[nom exact de la distinction]</w:t>
+      </w:r>
+      <w:r>
+        <w:t>.</w:t>
+      </w:r>
+      <w:r/>
+    </w:p>
+    <w:p>
+      <w:r/>
+      <w:r>
+        <w:t>J’ai eu l’honneur de la recevoir, mais cette distinction ne m’appartient pas. Elle appartient à nos équipes, qui ont travaillé souvent avec peu de moyens. Elle appartient aux femmes leaders de Mamou qui ont pris la parole, aux leaders religieux qui ont accepté d’ouvrir le dialogue, et aux jeunes qui se sont engagé·es. Elle montre surtout qu’une organisation guinéenne de terrain peut être reconnue à l’échelle du continent. Et Marrakech nous a rappelé une chose : il n’y a pas de paix durable pour les femmes et les jeunes sans autonomie économique, un point que nos collègues avaient déjà soulevé à Somone. Et c’est un message pour chacune et chacun d’entre vous : votre travail compte, et il peut être vu.</w:t>
+      </w:r>
       <w:r/>
     </w:p>
     <w:p>
@@ -535,10 +698,10 @@
         <w:rPr>
           <w:b/>
         </w:rPr>
-        <w:t>Première leçon : les résistances existent, et elles se lèvent par le dialogue.</w:t>
+        <w:t>Les résistances se lèvent par le dialogue.</w:t>
       </w:r>
       <w:r>
-        <w:t xml:space="preserve"> Au début, certaines personnes ont résisté aux messages, en particulier sur les MGF et sur la place des femmes dans les mécanismes de paix. Nous n’avons pas imposé : nous avons pris le temps d’en discuter en profondeur. Et lorsque les leaders religieux ont pris la parole eux-mêmes, le message a été reçu autrement.</w:t>
+        <w:t xml:space="preserve"> Au début, certaines personnes ont résisté aux messages, en particulier sur les MGF. Nous n’avons pas imposé : nous avons discuté, et lorsque les leaders religieux ont pris la parole eux-mêmes, le message a été reçu autrement.</w:t>
       </w:r>
       <w:r/>
     </w:p>
@@ -548,7 +711,7 @@
         <w:rPr>
           <w:b/>
         </w:rPr>
-        <w:t>Deuxième leçon : la culture est un outil de plaidoyer.</w:t>
+        <w:t>La culture est un outil de plaidoyer.</w:t>
       </w:r>
       <w:r>
         <w:t xml:space="preserve"> Une pièce de théâtre en langue locale explique la résolution 1325 mieux qu’un long discours.</w:t>
@@ -561,117 +724,31 @@
         <w:rPr>
           <w:b/>
         </w:rPr>
-        <w:t>Troisième leçon : les jeunes et les aîné·es ont besoin les un·es des autres.</w:t>
+        <w:t>Les générations ont besoin l’une de l’autre.</w:t>
       </w:r>
       <w:r>
-        <w:t xml:space="preserve"> Les femmes leaders apportent l’expérience ; les jeunes apportent l’énergie et de nouveaux outils. C’est tout l’esprit de ce forum.</w:t>
+        <w:t xml:space="preserve"> Les femmes leaders apportent l’expérience ; les jeunes apportent l’énergie et de nouveaux outils.</w:t>
       </w:r>
       <w:r/>
     </w:p>
     <w:p>
       <w:r/>
       <w:r>
-        <w:t>Ce qui nous freine (1 minute)</w:t>
+        <w:t>Ce qui nous freine (30 secondes)</w:t>
       </w:r>
       <w:r/>
     </w:p>
     <w:p>
       <w:r/>
       <w:r>
-        <w:t>Nous voulons être honnêtes, car c’est aussi cela, la redevabilité :</w:t>
+        <w:t>Nous restons lucides : la mobilisation des participant·es est difficile, la logistique coûte cher, nos activités dépendent de financements par projet, et nous devons encore mieux mesurer le changement réel dans les attitudes et les comportements.</w:t>
       </w:r>
-      <w:r/>
-      <w:r/>
-    </w:p>
-    <w:p>
-      <w:pPr>
-        <w:pStyle w:val="ListBullet"/>
-        <w:spacing w:line="240" w:lineRule="auto"/>
-        <w:ind w:left="720"/>
-      </w:pPr>
-      <w:r/>
-      <w:r>
-        <w:t xml:space="preserve">la </w:t>
-      </w:r>
-      <w:r>
-        <w:rPr>
-          <w:b/>
-        </w:rPr>
-        <w:t>mobilisation</w:t>
-      </w:r>
-      <w:r>
-        <w:t xml:space="preserve"> des participant·es est difficile, faute de temps et à cause de leurs engagements personnels ;</w:t>
-      </w:r>
-      <w:r/>
-    </w:p>
-    <w:p>
-      <w:pPr>
-        <w:pStyle w:val="ListBullet"/>
-        <w:spacing w:line="240" w:lineRule="auto"/>
-        <w:ind w:left="720"/>
-      </w:pPr>
-      <w:r/>
-      <w:r>
-        <w:t xml:space="preserve">la </w:t>
-      </w:r>
-      <w:r>
-        <w:rPr>
-          <w:b/>
-        </w:rPr>
-        <w:t>logistique</w:t>
-      </w:r>
-      <w:r>
-        <w:t xml:space="preserve"> et la coordination demandent des moyens que nos organisations n’ont pas toujours ;</w:t>
-      </w:r>
-      <w:r/>
-    </w:p>
-    <w:p>
-      <w:pPr>
-        <w:pStyle w:val="ListBullet"/>
-        <w:spacing w:line="240" w:lineRule="auto"/>
-        <w:ind w:left="720"/>
-      </w:pPr>
-      <w:r/>
-      <w:r>
-        <w:t xml:space="preserve">les activités reposent sur des </w:t>
-      </w:r>
-      <w:r>
-        <w:rPr>
-          <w:b/>
-        </w:rPr>
-        <w:t>financements par projet</w:t>
-      </w:r>
-      <w:r>
-        <w:t xml:space="preserve"> : quand le projet s’arrête, la dynamique risque de s’arrêter aussi ;</w:t>
-      </w:r>
-      <w:r/>
-    </w:p>
-    <w:p>
-      <w:pPr>
-        <w:pStyle w:val="ListBullet"/>
-        <w:spacing w:line="240" w:lineRule="auto"/>
-        <w:ind w:left="720"/>
-      </w:pPr>
-      <w:r/>
-      <w:r>
-        <w:t xml:space="preserve">nous savons combien de personnes nous avons touchées, mais nous devons encore </w:t>
-      </w:r>
-      <w:r>
-        <w:rPr>
-          <w:b/>
-        </w:rPr>
-        <w:t>mesurer le changement réel</w:t>
-      </w:r>
-      <w:r>
-        <w:t xml:space="preserve"> dans les attitudes et les comportements.</w:t>
-      </w:r>
-      <w:r/>
       <w:r/>
     </w:p>
     <w:p>
       <w:r/>
       <w:r>
-        <w:t>Nos propositions pour la région (1 minute 30)</w:t>
+        <w:t>Nos propositions pour la région (1 minute)</w:t>
       </w:r>
       <w:r/>
       <w:r/>
@@ -690,7 +767,7 @@
         <w:t>Reproduire le modèle « cinq formats »</w:t>
       </w:r>
       <w:r>
-        <w:t xml:space="preserve"> (radio, table ronde, lieu de culte, scène, dialogue intergénérationnel) pour la campagne régionale sur les violences faites aux femmes et aux filles décidée à Somone.</w:t>
+        <w:t xml:space="preserve"> dans la campagne régionale sur les violences faites aux femmes et aux filles décidée à Somone.</w:t>
       </w:r>
       <w:r/>
     </w:p>
@@ -705,10 +782,10 @@
         <w:rPr>
           <w:b/>
         </w:rPr>
-        <w:t>Associer systématiquement les leaders religieux et communautaires</w:t>
+        <w:t>Associer les leaders religieux et communautaires</w:t>
       </w:r>
       <w:r>
-        <w:t xml:space="preserve"> aux campagnes sur les VBG et les MGF, dans chaque pays du réseau.</w:t>
+        <w:t xml:space="preserve"> aux campagnes sur les VBG et les MGF dans chaque pays du réseau.</w:t>
       </w:r>
       <w:r/>
     </w:p>
@@ -723,10 +800,10 @@
         <w:rPr>
           <w:b/>
         </w:rPr>
-        <w:t>Mesurer le changement, pas seulement la participation</w:t>
+        <w:t>Construire ensemble des indicateurs communs</w:t>
       </w:r>
       <w:r>
-        <w:t xml:space="preserve"> : nous proposons de construire ensemble, dans le réseau, des indicateurs communs sur l’évolution des attitudes, en nous appuyant sur les indicateurs déjà validés en Guinée par notre Groupe de Travail.</w:t>
+        <w:t xml:space="preserve"> pour mesurer le changement d’attitude, pas seulement la participation.</w:t>
       </w:r>
       <w:r/>
     </w:p>
@@ -750,6 +827,24 @@
         <w:t xml:space="preserve"> pour les organisations locales de femmes et de jeunes.</w:t>
       </w:r>
       <w:r/>
+    </w:p>
+    <w:p>
+      <w:pPr>
+        <w:pStyle w:val="ListNumber"/>
+        <w:spacing w:line="240" w:lineRule="auto"/>
+        <w:ind w:left="720"/>
+      </w:pPr>
+      <w:r/>
+      <w:r>
+        <w:rPr>
+          <w:b/>
+        </w:rPr>
+        <w:t>Relier les agendas</w:t>
+      </w:r>
+      <w:r>
+        <w:t xml:space="preserve"> : faire le lien entre notre réseau Femmes, Jeunes, Paix et Sécurité et les réseaux panafricains d’autonomisation des jeunes, comme YES Africa, pour que l’autonomie économique des jeunes femmes fasse partie de nos stratégies de paix.</w:t>
+      </w:r>
+      <w:r/>
       <w:r/>
     </w:p>
     <w:p>
@@ -762,7 +857,7 @@
     <w:p>
       <w:r/>
       <w:r>
-        <w:t>À Somone, nous avons dit que la politique est façonnée par celles et ceux qui s’engagent. À Mamou, nous avons appris que la paix se construit aussi à la radio, sur une scène de théâtre et dans un lieu de culte. Nos voix, notre paix : portons-les jusqu’au dernier village.</w:t>
+        <w:t>À Somone, nous avons dit que la politique est façonnée par celles et ceux qui s’engagent. Depuis, à Mamou comme à Marrakech, nous avons appris que l’engagement finit toujours par être vu. Nos voix, notre paix : continuons à les porter ensemble, jusqu’au dernier village.</w:t>
       </w:r>
       <w:r/>
     </w:p>
@@ -1034,7 +1129,228 @@
               <w:t>Plus de 180 personnes</w:t>
             </w:r>
             <w:r>
-              <w:t xml:space="preserve"> , sans compter les auditeur·rices de la radio et les participant·es aux dialogues intergénérationnels, dont le nombre n’est pas précisé dans le rapport</w:t>
+              <w:t xml:space="preserve"> (hors radio et dialogues intergénérationnels, dont le nombre n’est pas précisé)</w:t>
+            </w:r>
+          </w:p>
+        </w:tc>
+      </w:tr>
+    </w:tbl>
+    <w:p>
+      <w:r/>
+    </w:p>
+    <w:p>
+      <w:pPr>
+        <w:pStyle w:val="Heading2"/>
+      </w:pPr>
+      <w:r>
+        <w:rPr>
+          <w:color w:val="6A1B9A"/>
+        </w:rPr>
+        <w:t>4. Repères sur le YES Africa Summit 2025 (sources publiques)</w:t>
+      </w:r>
+      <w:r>
+        <w:rPr>
+          <w:color w:val="6A1B9A"/>
+        </w:rPr>
+      </w:r>
+    </w:p>
+    <w:tbl>
+      <w:tblPr>
+        <w:tblStyle w:val="TableGrid"/>
+        <w:tblW w:type="auto" w:w="0"/>
+        <w:tblLook w:firstColumn="1" w:firstRow="1" w:lastColumn="0" w:lastRow="0" w:noHBand="0" w:noVBand="1" w:val="04A0"/>
+      </w:tblPr>
+      <w:tblGrid>
+        <w:gridCol w:w="4320"/>
+        <w:gridCol w:w="4320"/>
+      </w:tblGrid>
+      <w:tr>
+        <w:tc>
+          <w:tcPr>
+            <w:tcW w:type="dxa" w:w="4320"/>
+          </w:tcPr>
+          <w:p>
+            <w:r>
+              <w:rPr>
+                <w:b/>
+              </w:rPr>
+              <w:t>Élément</w:t>
+            </w:r>
+          </w:p>
+        </w:tc>
+        <w:tc>
+          <w:tcPr>
+            <w:tcW w:type="dxa" w:w="4320"/>
+          </w:tcPr>
+          <w:p>
+            <w:r>
+              <w:rPr>
+                <w:b/>
+              </w:rPr>
+              <w:t>Information</w:t>
+            </w:r>
+          </w:p>
+        </w:tc>
+      </w:tr>
+      <w:tr>
+        <w:tc>
+          <w:tcPr>
+            <w:tcW w:type="dxa" w:w="4320"/>
+          </w:tcPr>
+          <w:p>
+            <w:r>
+              <w:t>Nom officiel</w:t>
+            </w:r>
+          </w:p>
+        </w:tc>
+        <w:tc>
+          <w:tcPr>
+            <w:tcW w:type="dxa" w:w="4320"/>
+          </w:tcPr>
+          <w:p>
+            <w:r>
+              <w:t xml:space="preserve">Youth Empowerment Summit – Africa (YES Africa), 1 </w:t>
+            </w:r>
+            <w:r>
+              <w:rPr>
+                <w:vertAlign w:val="superscript"/>
+              </w:rPr>
+              <w:t>re</w:t>
+            </w:r>
+            <w:r>
+              <w:t xml:space="preserve"> édition</w:t>
+            </w:r>
+          </w:p>
+        </w:tc>
+      </w:tr>
+      <w:tr>
+        <w:tc>
+          <w:tcPr>
+            <w:tcW w:type="dxa" w:w="4320"/>
+          </w:tcPr>
+          <w:p>
+            <w:r>
+              <w:t>Dates et lieu</w:t>
+            </w:r>
+          </w:p>
+        </w:tc>
+        <w:tc>
+          <w:tcPr>
+            <w:tcW w:type="dxa" w:w="4320"/>
+          </w:tcPr>
+          <w:p>
+            <w:r>
+              <w:t>19 et 20 juin 2025, Marrakech (Maroc)</w:t>
+            </w:r>
+          </w:p>
+        </w:tc>
+      </w:tr>
+      <w:tr>
+        <w:tc>
+          <w:tcPr>
+            <w:tcW w:type="dxa" w:w="4320"/>
+          </w:tcPr>
+          <w:p>
+            <w:r>
+              <w:t>Organisateurs</w:t>
+            </w:r>
+          </w:p>
+        </w:tc>
+        <w:tc>
+          <w:tcPr>
+            <w:tcW w:type="dxa" w:w="4320"/>
+          </w:tcPr>
+          <w:p>
+            <w:r>
+              <w:t>Fondation Jadara et Union Panafricaine de la Jeunesse</w:t>
+            </w:r>
+          </w:p>
+        </w:tc>
+      </w:tr>
+      <w:tr>
+        <w:tc>
+          <w:tcPr>
+            <w:tcW w:type="dxa" w:w="4320"/>
+          </w:tcPr>
+          <w:p>
+            <w:r>
+              <w:t>Participation</w:t>
+            </w:r>
+          </w:p>
+        </w:tc>
+        <w:tc>
+          <w:tcPr>
+            <w:tcW w:type="dxa" w:w="4320"/>
+          </w:tcPr>
+          <w:p>
+            <w:r>
+              <w:t>Plus de 1 000 jeunes leaders et représentant·es de 118 ONG venues de 43 pays africains</w:t>
+            </w:r>
+          </w:p>
+        </w:tc>
+      </w:tr>
+      <w:tr>
+        <w:tc>
+          <w:tcPr>
+            <w:tcW w:type="dxa" w:w="4320"/>
+          </w:tcPr>
+          <w:p>
+            <w:r>
+              <w:t>Public visé</w:t>
+            </w:r>
+          </w:p>
+        </w:tc>
+        <w:tc>
+          <w:tcPr>
+            <w:tcW w:type="dxa" w:w="4320"/>
+          </w:tcPr>
+          <w:p>
+            <w:r>
+              <w:t>Les jeunes sans emploi, hors de l’école ou sans formation (NEET)</w:t>
+            </w:r>
+          </w:p>
+        </w:tc>
+      </w:tr>
+      <w:tr>
+        <w:tc>
+          <w:tcPr>
+            <w:tcW w:type="dxa" w:w="4320"/>
+          </w:tcPr>
+          <w:p>
+            <w:r>
+              <w:t>Thèmes</w:t>
+            </w:r>
+          </w:p>
+        </w:tc>
+        <w:tc>
+          <w:tcPr>
+            <w:tcW w:type="dxa" w:w="4320"/>
+          </w:tcPr>
+          <w:p>
+            <w:r>
+              <w:t>Éducation non formelle, entrepreneuriat, innovation, technologie, migration, engagement citoyen, partenariats ; « marché des idées » où des projets à fort impact ont été présentés</w:t>
+            </w:r>
+          </w:p>
+        </w:tc>
+      </w:tr>
+      <w:tr>
+        <w:tc>
+          <w:tcPr>
+            <w:tcW w:type="dxa" w:w="4320"/>
+          </w:tcPr>
+          <w:p>
+            <w:r>
+              <w:t>Résultats</w:t>
+            </w:r>
+          </w:p>
+        </w:tc>
+        <w:tc>
+          <w:tcPr>
+            <w:tcW w:type="dxa" w:w="4320"/>
+          </w:tcPr>
+          <w:p>
+            <w:r>
+              <w:t>Manifeste de l’économie sociale, livre blanc de recommandations, guide des bonnes pratiques, catalogue d’initiatives innovantes</w:t>
             </w:r>
           </w:p>
         </w:tc>
@@ -1046,13 +1362,59 @@
     <w:p>
       <w:r/>
       <w:r>
+        <w:t xml:space="preserve">Sources : </w:t>
+      </w:r>
+      <w:hyperlink r:id="rId9">
+        <w:r>
+          <w:rPr>
+            <w:color w:val="0000EE"/>
+            <w:u w:val="single"/>
+          </w:rPr>
+          <w:t>Nations Unies, « Young people drive solutions at YES Africa’s first summit »</w:t>
+        </w:r>
+      </w:hyperlink>
+      <w:r>
+        <w:t xml:space="preserve"> ; </w:t>
+      </w:r>
+      <w:hyperlink r:id="rId10">
+        <w:r>
+          <w:rPr>
+            <w:color w:val="0000EE"/>
+            <w:u w:val="single"/>
+          </w:rPr>
+          <w:t>Fondation Jadara</w:t>
+        </w:r>
+      </w:hyperlink>
+      <w:r>
+        <w:t xml:space="preserve"> ; </w:t>
+      </w:r>
+      <w:hyperlink r:id="rId11">
+        <w:r>
+          <w:rPr>
+            <w:color w:val="0000EE"/>
+            <w:u w:val="single"/>
+          </w:rPr>
+          <w:t>Opportunity Desk, appel aux ONG africaines</w:t>
+        </w:r>
+      </w:hyperlink>
+      <w:r>
+        <w:t>.</w:t>
+      </w:r>
+      <w:r/>
+    </w:p>
+    <w:p>
+      <w:r/>
+      <w:r>
+        <w:t xml:space="preserve">Le nom officiel est </w:t>
+      </w:r>
+      <w:r>
         <w:rPr>
           <w:b/>
         </w:rPr>
-        <w:t>Cadre national (Groupe de Travail, 2024) :</w:t>
+        <w:t>« Youth Empowerment Summit – YES Africa »</w:t>
       </w:r>
       <w:r>
-        <w:t xml:space="preserve"> stratégie nationale de plaidoyer construite à partir de 11 plans locaux ; indicateurs d’une plateforme numérique de suivi de la participation des filles et des femmes validés en juillet 2024.</w:t>
+        <w:t>. Utilisez ce nom, plutôt que « YES Empowerment Summit », sur les diapositives et les réseaux sociaux : les participant·es pourront ainsi vérifier facilement.</w:t>
       </w:r>
       <w:r/>
     </w:p>
@@ -1064,7 +1426,7 @@
         <w:rPr>
           <w:color w:val="6A1B9A"/>
         </w:rPr>
-        <w:t>4. Support visuel (7 diapositives)</w:t>
+        <w:t>5. Support visuel (8 diapositives)</w:t>
       </w:r>
       <w:r>
         <w:rPr>
@@ -1151,10 +1513,7 @@
           </w:tcPr>
           <w:p>
             <w:r>
-              <w:t xml:space="preserve">« Porter la paix jusqu’aux communautés », logos de Guinée Impact et du GT, Mamadou BARRY, </w:t>
-            </w:r>
-            <w:r>
-              <w:t>[fonction]</w:t>
+              <w:t>« De Somone à Dakar : le parcours de Guinée Impact », logo, Mamadou BARRY, Président</w:t>
             </w:r>
           </w:p>
         </w:tc>
@@ -1176,7 +1535,7 @@
           </w:tcPr>
           <w:p>
             <w:r>
-              <w:t>Qui nous sommes</w:t>
+              <w:t>Guinée Impact en bref</w:t>
             </w:r>
           </w:p>
         </w:tc>
@@ -1186,7 +1545,7 @@
           </w:tcPr>
           <w:p>
             <w:r>
-              <w:t>Guinée Impact, membre du GTFJPS-AOS/GN, partenaire du projet FIFEP</w:t>
+              <w:t>Mission, zones, équipe (photo d’équipe), membre du GTFJPS-AOS/GN, partenaire FIFEP</w:t>
             </w:r>
           </w:p>
         </w:tc>
@@ -1208,7 +1567,7 @@
           </w:tcPr>
           <w:p>
             <w:r>
-              <w:t>De la stratégie aux communautés</w:t>
+              <w:t>Notre parcours</w:t>
             </w:r>
           </w:p>
         </w:tc>
@@ -1218,7 +1577,7 @@
           </w:tcPr>
           <w:p>
             <w:r>
-              <w:t>Schéma : 11 plans locaux → stratégie nationale → Mamou</w:t>
+              <w:t>Frise : Somone → Mamou (janvier 2025) → Marrakech (juin 2025) → Dakar (2026)</w:t>
             </w:r>
           </w:p>
         </w:tc>
@@ -1240,7 +1599,7 @@
           </w:tcPr>
           <w:p>
             <w:r>
-              <w:t>Cinq jours, cinq formats</w:t>
+              <w:t>Mamou : cinq jours, cinq formats</w:t>
             </w:r>
           </w:p>
         </w:tc>
@@ -1250,7 +1609,7 @@
           </w:tcPr>
           <w:p>
             <w:r>
-              <w:t>Frise du 16 au 20 janvier avec une photo et un chiffre par activité</w:t>
+              <w:t>Une photo et un chiffre par activité</w:t>
             </w:r>
           </w:p>
         </w:tc>
@@ -1272,7 +1631,7 @@
           </w:tcPr>
           <w:p>
             <w:r>
-              <w:t>Ce que nous avons appris</w:t>
+              <w:t>YES Africa 2025, Marrakech</w:t>
             </w:r>
           </w:p>
         </w:tc>
@@ -1282,7 +1641,7 @@
           </w:tcPr>
           <w:p>
             <w:r>
-              <w:t>Les 3 leçons, avec une photo du dialogue avec les leaders religieux ou de la soirée théâtre</w:t>
+              <w:t>Photo de la remise de la distinction, nom exact ; « 1 000 jeunes leaders, 118 ONG, 43 pays » ; mention « Une reconnaissance collective »</w:t>
             </w:r>
           </w:p>
         </w:tc>
@@ -1304,7 +1663,7 @@
           </w:tcPr>
           <w:p>
             <w:r>
-              <w:t>Nos défis</w:t>
+              <w:t>Ce que nous avons appris</w:t>
             </w:r>
           </w:p>
         </w:tc>
@@ -1314,7 +1673,7 @@
           </w:tcPr>
           <w:p>
             <w:r>
-              <w:t>Mobilisation, logistique, financement, mesure du changement</w:t>
+              <w:t>Les 3 leçons</w:t>
             </w:r>
           </w:p>
         </w:tc>
@@ -1346,7 +1705,39 @@
           </w:tcPr>
           <w:p>
             <w:r>
-              <w:t>Les 4 propositions et la phrase de conclusion</w:t>
+              <w:t>Les 5 propositions pour la région</w:t>
+            </w:r>
+          </w:p>
+        </w:tc>
+      </w:tr>
+      <w:tr>
+        <w:tc>
+          <w:tcPr>
+            <w:tcW w:type="dxa" w:w="2880"/>
+          </w:tcPr>
+          <w:p>
+            <w:r>
+              <w:t>8</w:t>
+            </w:r>
+          </w:p>
+        </w:tc>
+        <w:tc>
+          <w:tcPr>
+            <w:tcW w:type="dxa" w:w="2880"/>
+          </w:tcPr>
+          <w:p>
+            <w:r>
+              <w:t>Merci</w:t>
+            </w:r>
+          </w:p>
+        </w:tc>
+        <w:tc>
+          <w:tcPr>
+            <w:tcW w:type="dxa" w:w="2880"/>
+          </w:tcPr>
+          <w:p>
+            <w:r>
+              <w:t>Phrase de conclusion, contacts et réseaux sociaux de Guinée Impact</w:t>
             </w:r>
           </w:p>
         </w:tc>
@@ -1363,7 +1754,7 @@
         <w:rPr>
           <w:color w:val="6A1B9A"/>
         </w:rPr>
-        <w:t>5. Questions possibles et éléments de réponse</w:t>
+        <w:t>6. Questions possibles et éléments de réponse</w:t>
       </w:r>
       <w:r>
         <w:rPr>
@@ -1416,6 +1807,28 @@
           </w:tcPr>
           <w:p>
             <w:r>
+              <w:t>Pour quoi Guinée Impact a-t-elle été distinguée au Maroc ?</w:t>
+            </w:r>
+          </w:p>
+        </w:tc>
+        <w:tc>
+          <w:tcPr>
+            <w:tcW w:type="dxa" w:w="4320"/>
+          </w:tcPr>
+          <w:p>
+            <w:r>
+              <w:t>[À compléter : critères ou motif de la distinction]</w:t>
+            </w:r>
+          </w:p>
+        </w:tc>
+      </w:tr>
+      <w:tr>
+        <w:tc>
+          <w:tcPr>
+            <w:tcW w:type="dxa" w:w="4320"/>
+          </w:tcPr>
+          <w:p>
+            <w:r>
               <w:t>Comment avez-vous convaincu les leaders religieux de participer ?</w:t>
             </w:r>
           </w:p>
@@ -1426,10 +1839,35 @@
           </w:tcPr>
           <w:p>
             <w:r>
-              <w:t>[À compléter avec votre expérience : prise de contact, arguments utilisés]</w:t>
+              <w:t>[À compléter avec votre expérience]</w:t>
             </w:r>
             <w:r>
               <w:t xml:space="preserve"> . Le dialogue a eu lieu dans un lieu de culte, avec eux comme porte-parole.</w:t>
+            </w:r>
+          </w:p>
+        </w:tc>
+      </w:tr>
+      <w:tr>
+        <w:tc>
+          <w:tcPr>
+            <w:tcW w:type="dxa" w:w="4320"/>
+          </w:tcPr>
+          <w:p>
+            <w:r>
+              <w:t>Quelle place pour les femmes dans la direction de Guinée Impact ?</w:t>
+            </w:r>
+          </w:p>
+        </w:tc>
+        <w:tc>
+          <w:tcPr>
+            <w:tcW w:type="dxa" w:w="4320"/>
+          </w:tcPr>
+          <w:p>
+            <w:r>
+              <w:t>[À compléter : femmes dans l’équipe, le bureau, les postes de responsabilité]</w:t>
+            </w:r>
+            <w:r>
+              <w:t xml:space="preserve"> . Question probable dans un forum féministe : mieux vaut s’y préparer.</w:t>
             </w:r>
           </w:p>
         </w:tc>
@@ -1451,51 +1889,7 @@
           </w:tcPr>
           <w:p>
             <w:r>
-              <w:t>Sensibilisation d’un large public et partage d’expériences entre générations. Répondre franchement que la mesure des changements d’attitude reste à renforcer, et que c’est l’une de nos propositions.</w:t>
-            </w:r>
-          </w:p>
-        </w:tc>
-      </w:tr>
-      <w:tr>
-        <w:tc>
-          <w:tcPr>
-            <w:tcW w:type="dxa" w:w="4320"/>
-          </w:tcPr>
-          <w:p>
-            <w:r>
-              <w:t>Les jeunes présent·es se sont-ils et elles engagé·es par la suite ?</w:t>
-            </w:r>
-          </w:p>
-        </w:tc>
-        <w:tc>
-          <w:tcPr>
-            <w:tcW w:type="dxa" w:w="4320"/>
-          </w:tcPr>
-          <w:p>
-            <w:r>
-              <w:t>[À compléter : suites données, jeunes positionné·es dans des instances, nouvelles activités]</w:t>
-            </w:r>
-          </w:p>
-        </w:tc>
-      </w:tr>
-      <w:tr>
-        <w:tc>
-          <w:tcPr>
-            <w:tcW w:type="dxa" w:w="4320"/>
-          </w:tcPr>
-          <w:p>
-            <w:r>
-              <w:t>Comment reproduire l’expérience avec peu de moyens ?</w:t>
-            </w:r>
-          </w:p>
-        </w:tc>
-        <w:tc>
-          <w:tcPr>
-            <w:tcW w:type="dxa" w:w="4320"/>
-          </w:tcPr>
-          <w:p>
-            <w:r>
-              <w:t>Travailler avec les radios locales, les centres communautaires et les artistes locaux, et s’appuyer sur les leaders déjà respectés par la communauté.</w:t>
+              <w:t>Sensibilisation d’un large public et partage d’expériences entre générations. Reconnaître franchement que la mesure des changements d’attitude reste à renforcer.</w:t>
             </w:r>
           </w:p>
         </w:tc>
@@ -1512,7 +1906,7 @@
         <w:rPr>
           <w:color w:val="6A1B9A"/>
         </w:rPr>
-        <w:t>6. Publications pour les réseaux sociaux</w:t>
+        <w:t>7. Publications pour les réseaux sociaux</w:t>
       </w:r>
       <w:r>
         <w:rPr>
@@ -1575,7 +1969,7 @@
           </w:tcPr>
           <w:p>
             <w:r>
-              <w:t>🇬🇳 Aujourd’hui à #DeSomoneADakar, Guinée Impact partage son expérience à Mamou : comment porter le plaidoyer pour la participation des femmes à la paix jusqu’aux communautés. #Femmes1325 #Jeunes2250</w:t>
+              <w:t>🇬🇳 Aujourd’hui à #DeSomoneADakar, Mamadou BARRY, Président de Guinée Impact, présente notre parcours depuis Somone : de Mamou au Youth Empowerment Summit – YES Africa 2025 à Marrakech. Un travail d’équipe au service des femmes et des jeunes. #Femmes1325 #Jeunes2250</w:t>
             </w:r>
           </w:p>
         </w:tc>
@@ -1597,7 +1991,7 @@
           </w:tcPr>
           <w:p>
             <w:r>
-              <w:t>Radio, table ronde, lieu de culte, théâtre en langue locale, dialogue entre générations : 5 jours, 5 formats et plus de 180 personnes mobilisées à Mamou. « La paix se construit aussi sur une scène de théâtre. » #DeSomoneADakar #FinDesVBG</w:t>
+              <w:t>Radio, table ronde, lieu de culte, théâtre, dialogue entre générations : plus de 180 personnes mobilisées à Mamou, et une distinction à Marrakech parmi 118 ONG de 43 pays au #YESAfrica 2025. Merci à nos équipes et à nos partenaires ! #DeSomoneADakar #FinDesVBG</w:t>
             </w:r>
           </w:p>
         </w:tc>

</xml_diff>

<commit_message>
Correction des renvois de section
Co-Authored-By: Claude Opus 5.5 <noreply@anthropic.com>
Claude-Session: https://claude.ai/code/session_01Y44voEEgrqkDtN5faKYhcF
</commit_message>
<xml_diff>
--- a/Communication_Guinee_Impact_Forum_Dakar_2026.docx
+++ b/Communication_Guinee_Impact_Forum_Dakar_2026.docx
@@ -189,7 +189,7 @@
           </w:tcPr>
           <w:p>
             <w:r>
-              <w:t>Rapport d’activités de Guinée Impact à Mamou (janvier 2025) ; rapport annuel 2024 du GTFJPS-AOS/GN ; stratégie d’action validée à Somone ; informations fournies par Mamadou BARRY ; sources publiques sur le YES Africa Summit (voir section 3)</w:t>
+              <w:t>Rapport d’activités de Guinée Impact à Mamou (janvier 2025) ; rapport annuel 2024 du GTFJPS-AOS/GN ; stratégie d’action validée à Somone ; informations fournies par Mamadou BARRY ; sources publiques sur le YES Africa Summit (voir section 4)</w:t>
             </w:r>
           </w:p>
         </w:tc>
@@ -216,7 +216,7 @@
         <w:t>nom exact de la distinction</w:t>
       </w:r>
       <w:r>
-        <w:t xml:space="preserve"> reçue au YES Africa Summit et son motif ; autres activités menées depuis Somone. Les informations sur le sommet viennent de sources publiques (section 3). En revanche, je n’ai trouvé aucune source publique sur la distinction de Guinée Impact : son nom et son motif doivent venir de vous.</w:t>
+        <w:t xml:space="preserve"> reçue au YES Africa Summit et son motif ; autres activités menées depuis Somone. Les informations sur le sommet viennent de sources publiques (section 4). En revanche, je n’ai trouvé aucune source publique sur la distinction de Guinée Impact : son nom et son motif doivent venir de vous.</w:t>
       </w:r>
       <w:r/>
     </w:p>

</xml_diff>

<commit_message>
Ajout du rôle d'ambassadeur du festival Les 7 Jours du 7e Art dans la communication
Co-Authored-By: Claude Opus 5.5 <noreply@anthropic.com>
Claude-Session: https://claude.ai/code/session_01Y44voEEgrqkDtN5faKYhcF
</commit_message>
<xml_diff>
--- a/Communication_Guinee_Impact_Forum_Dakar_2026.docx
+++ b/Communication_Guinee_Impact_Forum_Dakar_2026.docx
@@ -164,7 +164,7 @@
               <w:t>re</w:t>
             </w:r>
             <w:r>
-              <w:t xml:space="preserve"> édition à Somone, avec ses équipes et ses partenaires, et la distinction reçue au Youth Empowerment Summit – YES Africa 2025, à Marrakech</w:t>
+              <w:t xml:space="preserve"> édition à Somone, avec ses équipes et ses partenaires, la distinction reçue au Youth Empowerment Summit – YES Africa 2025 à Marrakech, et son rôle d’ambassadeur du festival de cinéma « Les 7 Jours du 7ᵉ Art »</w:t>
             </w:r>
           </w:p>
         </w:tc>
@@ -189,7 +189,7 @@
           </w:tcPr>
           <w:p>
             <w:r>
-              <w:t>Rapport d’activités de Guinée Impact à Mamou (janvier 2025) ; rapport annuel 2024 du GTFJPS-AOS/GN ; stratégie d’action validée à Somone ; informations fournies par Mamadou BARRY ; sources publiques sur le YES Africa Summit (voir section 4)</w:t>
+              <w:t>Rapport d’activités de Guinée Impact à Mamou (janvier 2025) ; rapport annuel 2024 du GTFJPS-AOS/GN ; stratégie d’action validée à Somone ; informations fournies par Mamadou BARRY ; sources publiques sur le YES Africa Summit et le festival Les 7 Jours du 7ᵉ Art (voir sections 4 et 5)</w:t>
             </w:r>
           </w:p>
         </w:tc>
@@ -216,7 +216,16 @@
         <w:t>nom exact de la distinction</w:t>
       </w:r>
       <w:r>
-        <w:t xml:space="preserve"> reçue au YES Africa Summit et son motif ; autres activités menées depuis Somone. Les informations sur le sommet viennent de sources publiques (section 4). En revanche, je n’ai trouvé aucune source publique sur la distinction de Guinée Impact : son nom et son motif doivent venir de vous.</w:t>
+        <w:t xml:space="preserve"> reçue au YES Africa Summit et son motif ; autres activités menées depuis Somone ; </w:t>
+      </w:r>
+      <w:r>
+        <w:rPr>
+          <w:b/>
+        </w:rPr>
+        <w:t>édition du festival Les 7 Jours du 7ᵉ Art</w:t>
+      </w:r>
+      <w:r>
+        <w:t xml:space="preserve"> dont vous êtes ambassadeur et ce que vous y avez fait. Les informations sur le sommet et le festival viennent de sources publiques (sections 4 et 5). En revanche, je n’ai trouvé aucune source publique sur la distinction de Guinée Impact : son nom et son motif doivent venir de vous.</w:t>
       </w:r>
       <w:r/>
     </w:p>
@@ -268,7 +277,7 @@
         <w:rPr>
           <w:color w:val="6A1B9A"/>
         </w:rPr>
-        <w:t>1. Trois messages à retenir</w:t>
+        <w:t>1. Quatre messages à retenir</w:t>
       </w:r>
       <w:r>
         <w:rPr>
@@ -319,6 +328,24 @@
       </w:r>
       <w:r>
         <w:t xml:space="preserve"> La distinction reçue au Youth Empowerment Summit – YES Africa 2025, à Marrakech, parmi 118 ONG de 43 pays africains, appartient aux équipes, aux partenaires et aux femmes et jeunes avec qui nous travaillons.</w:t>
+      </w:r>
+      <w:r/>
+    </w:p>
+    <w:p>
+      <w:pPr>
+        <w:pStyle w:val="ListNumber"/>
+        <w:spacing w:line="240" w:lineRule="auto"/>
+        <w:ind w:left="720"/>
+      </w:pPr>
+      <w:r/>
+      <w:r>
+        <w:rPr>
+          <w:b/>
+        </w:rPr>
+        <w:t>La culture est un levier de paix.</w:t>
+      </w:r>
+      <w:r>
+        <w:t xml:space="preserve"> Du théâtre en langue locale à Mamou au cinéma, comme ambassadeur du festival Les 7 Jours du 7ᵉ Art, l’art permet de porter les messages sur les droits des femmes et la paix là où les discours ne vont pas.</w:t>
       </w:r>
       <w:r/>
     </w:p>
@@ -403,7 +430,7 @@
     <w:p>
       <w:r/>
       <w:r>
-        <w:t>Guinée Impact en bref (1 minute)</w:t>
+        <w:t>Guinée Impact en bref (30 secondes)</w:t>
       </w:r>
       <w:r/>
     </w:p>
@@ -496,6 +523,30 @@
       <w:r/>
       <w:r>
         <w:t>[Autres activités menées depuis Somone : date, lieu, résultat]</w:t>
+      </w:r>
+      <w:r/>
+    </w:p>
+    <w:p>
+      <w:pPr>
+        <w:pStyle w:val="ListBullet"/>
+        <w:spacing w:line="240" w:lineRule="auto"/>
+        <w:ind w:left="720"/>
+      </w:pPr>
+      <w:r/>
+      <w:r>
+        <w:rPr>
+          <w:b/>
+        </w:rPr>
+        <w:t>[Année]</w:t>
+      </w:r>
+      <w:r>
+        <w:rPr>
+          <w:b/>
+        </w:rPr>
+        <w:t>, Conakry</w:t>
+      </w:r>
+      <w:r>
+        <w:t xml:space="preserve"> : je deviens ambassadeur du festival de cinéma Les 7 Jours du 7ᵉ Art.</w:t>
       </w:r>
       <w:r/>
     </w:p>
@@ -688,7 +739,46 @@
     <w:p>
       <w:r/>
       <w:r>
-        <w:t>Ce que nous avons appris (1 minute 30)</w:t>
+        <w:t>La culture au service de la paix : le cinéma (1 minute)</w:t>
+      </w:r>
+      <w:r/>
+    </w:p>
+    <w:p>
+      <w:r/>
+      <w:r>
+        <w:t xml:space="preserve">Je suis également ambassadeur du festival </w:t>
+      </w:r>
+      <w:r>
+        <w:rPr>
+          <w:b/>
+        </w:rPr>
+        <w:t>Les 7 Jours du 7ᵉ Art</w:t>
+      </w:r>
+      <w:r>
+        <w:t xml:space="preserve">, </w:t>
+      </w:r>
+      <w:r>
+        <w:t>[édition / depuis quelle année]</w:t>
+      </w:r>
+      <w:r>
+        <w:t>. Chaque année en décembre, à Conakry, ce festival fait vivre le cinéma guinéen et ouvre aux jeunes cinéastes des occasions de se former, de diffuser leurs films et de coproduire. Sa 7ᵉ édition, du 6 au 12 décembre 2025, avait pour thème « L’Encre et l’Écran » et a reçu plus de 315 films venus d’Afrique, d’Europe, d’Asie, d’Amérique et du Moyen-Orient.</w:t>
+      </w:r>
+      <w:r/>
+    </w:p>
+    <w:p>
+      <w:r/>
+      <w:r>
+        <w:t xml:space="preserve">Pourquoi un défenseur de la paix s’engage-t-il dans un festival de cinéma ? Parce qu’à Mamou, nous avons vu qu’une pièce de théâtre en langue locale touche plus de monde qu’un long discours. Le cinéma, c’est la même force, avec une portée encore plus grande. Les projections en plein air, les débats et les ateliers du festival sont des espaces où l’on peut parler des droits des femmes, des violences et de la paix avec le grand public, et surtout avec les jeunes. </w:t>
+      </w:r>
+      <w:r>
+        <w:t>[Si c’est le cas : ce que vous avez fait comme ambassadeur, par exemple un film ou un débat sur ces thèmes.]</w:t>
+      </w:r>
+      <w:r/>
+    </w:p>
+    <w:p>
+      <w:r/>
+      <w:r>
+        <w:t>Ce que nous avons appris (1 minute)</w:t>
       </w:r>
       <w:r/>
     </w:p>
@@ -714,7 +804,7 @@
         <w:t>La culture est un outil de plaidoyer.</w:t>
       </w:r>
       <w:r>
-        <w:t xml:space="preserve"> Une pièce de théâtre en langue locale explique la résolution 1325 mieux qu’un long discours.</w:t>
+        <w:t xml:space="preserve"> Théâtre ou cinéma : une histoire bien racontée explique la résolution 1325 mieux qu’un long discours.</w:t>
       </w:r>
       <w:r/>
     </w:p>
@@ -839,6 +929,24 @@
         <w:rPr>
           <w:b/>
         </w:rPr>
+        <w:t>Utiliser l’art et le cinéma</w:t>
+      </w:r>
+      <w:r>
+        <w:t xml:space="preserve"> : organiser, avec les festivals de la région comme Les 7 Jours du 7ᵉ Art, des ciné-débats sur les résolutions 1325 et 2250 et sur les violences faites aux femmes et aux filles, dans le cadre de la campagne régionale.</w:t>
+      </w:r>
+      <w:r/>
+    </w:p>
+    <w:p>
+      <w:pPr>
+        <w:pStyle w:val="ListNumber"/>
+        <w:spacing w:line="240" w:lineRule="auto"/>
+        <w:ind w:left="720"/>
+      </w:pPr>
+      <w:r/>
+      <w:r>
+        <w:rPr>
+          <w:b/>
+        </w:rPr>
         <w:t>Relier les agendas</w:t>
       </w:r>
       <w:r>
@@ -857,7 +965,7 @@
     <w:p>
       <w:r/>
       <w:r>
-        <w:t>À Somone, nous avons dit que la politique est façonnée par celles et ceux qui s’engagent. Depuis, à Mamou comme à Marrakech, nous avons appris que l’engagement finit toujours par être vu. Nos voix, notre paix : continuons à les porter ensemble, jusqu’au dernier village.</w:t>
+        <w:t>À Somone, nous avons dit que la politique est façonnée par celles et ceux qui s’engagent. Depuis, à Mamou, à Marrakech et sur les écrans de Conakry, nous avons appris que l’engagement finit toujours par être vu, et que l’art aide à le faire entendre. Nos voix, notre paix : continuons à les porter ensemble, jusqu’au dernier village.</w:t>
       </w:r>
       <w:r/>
     </w:p>
@@ -1426,7 +1534,281 @@
         <w:rPr>
           <w:color w:val="6A1B9A"/>
         </w:rPr>
-        <w:t>5. Support visuel (8 diapositives)</w:t>
+        <w:t>5. Repères sur le festival Les 7 Jours du 7ᵉ Art (sources publiques)</w:t>
+      </w:r>
+      <w:r>
+        <w:rPr>
+          <w:color w:val="6A1B9A"/>
+        </w:rPr>
+      </w:r>
+    </w:p>
+    <w:tbl>
+      <w:tblPr>
+        <w:tblStyle w:val="TableGrid"/>
+        <w:tblW w:type="auto" w:w="0"/>
+        <w:tblLook w:firstColumn="1" w:firstRow="1" w:lastColumn="0" w:lastRow="0" w:noHBand="0" w:noVBand="1" w:val="04A0"/>
+      </w:tblPr>
+      <w:tblGrid>
+        <w:gridCol w:w="4320"/>
+        <w:gridCol w:w="4320"/>
+      </w:tblGrid>
+      <w:tr>
+        <w:tc>
+          <w:tcPr>
+            <w:tcW w:type="dxa" w:w="4320"/>
+          </w:tcPr>
+          <w:p>
+            <w:r>
+              <w:rPr>
+                <w:b/>
+              </w:rPr>
+              <w:t>Élément</w:t>
+            </w:r>
+          </w:p>
+        </w:tc>
+        <w:tc>
+          <w:tcPr>
+            <w:tcW w:type="dxa" w:w="4320"/>
+          </w:tcPr>
+          <w:p>
+            <w:r>
+              <w:rPr>
+                <w:b/>
+              </w:rPr>
+              <w:t>Information</w:t>
+            </w:r>
+          </w:p>
+        </w:tc>
+      </w:tr>
+      <w:tr>
+        <w:tc>
+          <w:tcPr>
+            <w:tcW w:type="dxa" w:w="4320"/>
+          </w:tcPr>
+          <w:p>
+            <w:r>
+              <w:t>Nom</w:t>
+            </w:r>
+          </w:p>
+        </w:tc>
+        <w:tc>
+          <w:tcPr>
+            <w:tcW w:type="dxa" w:w="4320"/>
+          </w:tcPr>
+          <w:p>
+            <w:r>
+              <w:t>Les 7 Jours du 7ᵉ Art, festival de cinéma</w:t>
+            </w:r>
+          </w:p>
+        </w:tc>
+      </w:tr>
+      <w:tr>
+        <w:tc>
+          <w:tcPr>
+            <w:tcW w:type="dxa" w:w="4320"/>
+          </w:tcPr>
+          <w:p>
+            <w:r>
+              <w:t>Lieu et fréquence</w:t>
+            </w:r>
+          </w:p>
+        </w:tc>
+        <w:tc>
+          <w:tcPr>
+            <w:tcW w:type="dxa" w:w="4320"/>
+          </w:tcPr>
+          <w:p>
+            <w:r>
+              <w:t>Conakry (Guinée), chaque année en décembre</w:t>
+            </w:r>
+          </w:p>
+        </w:tc>
+      </w:tr>
+      <w:tr>
+        <w:tc>
+          <w:tcPr>
+            <w:tcW w:type="dxa" w:w="4320"/>
+          </w:tcPr>
+          <w:p>
+            <w:r>
+              <w:t>Objectif</w:t>
+            </w:r>
+          </w:p>
+        </w:tc>
+        <w:tc>
+          <w:tcPr>
+            <w:tcW w:type="dxa" w:w="4320"/>
+          </w:tcPr>
+          <w:p>
+            <w:r>
+              <w:t>Promouvoir le cinéma guinéen et offrir aux jeunes cinéastes des occasions de formation, de diffusion et de coproduction</w:t>
+            </w:r>
+          </w:p>
+        </w:tc>
+      </w:tr>
+      <w:tr>
+        <w:tc>
+          <w:tcPr>
+            <w:tcW w:type="dxa" w:w="4320"/>
+          </w:tcPr>
+          <w:p>
+            <w:r>
+              <w:t>Activités</w:t>
+            </w:r>
+          </w:p>
+        </w:tc>
+        <w:tc>
+          <w:tcPr>
+            <w:tcW w:type="dxa" w:w="4320"/>
+          </w:tcPr>
+          <w:p>
+            <w:r>
+              <w:t>Films nationaux et internationaux sur des thèmes sociaux, politiques et culturels ; projections en plein air ; conférences, débats, ateliers et spectacles</w:t>
+            </w:r>
+          </w:p>
+        </w:tc>
+      </w:tr>
+      <w:tr>
+        <w:tc>
+          <w:tcPr>
+            <w:tcW w:type="dxa" w:w="4320"/>
+          </w:tcPr>
+          <w:p>
+            <w:r>
+              <w:t>7ᵉ édition</w:t>
+            </w:r>
+          </w:p>
+        </w:tc>
+        <w:tc>
+          <w:tcPr>
+            <w:tcW w:type="dxa" w:w="4320"/>
+          </w:tcPr>
+          <w:p>
+            <w:r>
+              <w:t>Du 6 au 12 décembre 2025, thème « L’Encre et l’Écran » ; plus de 315 films reçus d’Afrique, d’Europe, d’Asie, d’Amérique et du Moyen-Orient ; 36 films en compétition</w:t>
+            </w:r>
+          </w:p>
+        </w:tc>
+      </w:tr>
+      <w:tr>
+        <w:tc>
+          <w:tcPr>
+            <w:tcW w:type="dxa" w:w="4320"/>
+          </w:tcPr>
+          <w:p>
+            <w:r>
+              <w:t>Lieux en 2025</w:t>
+            </w:r>
+          </w:p>
+        </w:tc>
+        <w:tc>
+          <w:tcPr>
+            <w:tcW w:type="dxa" w:w="4320"/>
+          </w:tcPr>
+          <w:p>
+            <w:r>
+              <w:t>Centre Culturel Franco-Guinéen, plage de Camayenne, Koumankan, rond-point de Hamdallaye</w:t>
+            </w:r>
+          </w:p>
+        </w:tc>
+      </w:tr>
+      <w:tr>
+        <w:tc>
+          <w:tcPr>
+            <w:tcW w:type="dxa" w:w="4320"/>
+          </w:tcPr>
+          <w:p>
+            <w:r>
+              <w:t>Direction</w:t>
+            </w:r>
+          </w:p>
+        </w:tc>
+        <w:tc>
+          <w:tcPr>
+            <w:tcW w:type="dxa" w:w="4320"/>
+          </w:tcPr>
+          <w:p>
+            <w:r>
+              <w:t>Amadou Oury Ba</w:t>
+            </w:r>
+          </w:p>
+        </w:tc>
+      </w:tr>
+    </w:tbl>
+    <w:p>
+      <w:r/>
+    </w:p>
+    <w:p>
+      <w:r/>
+      <w:r>
+        <w:t xml:space="preserve">Sources : </w:t>
+      </w:r>
+      <w:hyperlink r:id="rId12">
+        <w:r>
+          <w:rPr>
+            <w:color w:val="0000EE"/>
+            <w:u w:val="single"/>
+          </w:rPr>
+          <w:t>JCT Mali, « La 7ᵉ édition du Festival Les 7 Jours du 7ᵉ Art annonce un programme riche et ambitieux »</w:t>
+        </w:r>
+      </w:hyperlink>
+      <w:r>
+        <w:t xml:space="preserve"> ; </w:t>
+      </w:r>
+      <w:hyperlink r:id="rId13">
+        <w:r>
+          <w:rPr>
+            <w:color w:val="0000EE"/>
+            <w:u w:val="single"/>
+          </w:rPr>
+          <w:t>Icicine, « 7 Jours du 7ᵉ Art 2025 : 36 films en compétition »</w:t>
+        </w:r>
+      </w:hyperlink>
+      <w:r>
+        <w:t xml:space="preserve"> ; </w:t>
+      </w:r>
+      <w:hyperlink r:id="rId14">
+        <w:r>
+          <w:rPr>
+            <w:color w:val="0000EE"/>
+            <w:u w:val="single"/>
+          </w:rPr>
+          <w:t>Esbimedia</w:t>
+        </w:r>
+      </w:hyperlink>
+      <w:r>
+        <w:t xml:space="preserve"> ; </w:t>
+      </w:r>
+      <w:hyperlink r:id="rId15">
+        <w:r>
+          <w:rPr>
+            <w:color w:val="0000EE"/>
+            <w:u w:val="single"/>
+          </w:rPr>
+          <w:t>page Facebook du festival</w:t>
+        </w:r>
+      </w:hyperlink>
+      <w:r>
+        <w:t>.</w:t>
+      </w:r>
+      <w:r/>
+    </w:p>
+    <w:p>
+      <w:r/>
+      <w:r>
+        <w:t>Je n’ai pas pu ouvrir ces articles en entier, seulement leurs résumés dans les résultats de recherche. Relisez-les avant le forum pour confirmer les chiffres. Je n’ai trouvé aucune source publique sur votre rôle d’ambassadeur : l’édition et vos actions doivent venir de vous.</w:t>
+      </w:r>
+      <w:r/>
+    </w:p>
+    <w:p>
+      <w:pPr>
+        <w:pStyle w:val="Heading2"/>
+      </w:pPr>
+      <w:r>
+        <w:rPr>
+          <w:color w:val="6A1B9A"/>
+        </w:rPr>
+        <w:t>6. Support visuel (9 diapositives)</w:t>
       </w:r>
       <w:r>
         <w:rPr>
@@ -1663,6 +2045,38 @@
           </w:tcPr>
           <w:p>
             <w:r>
+              <w:t>La culture au service de la paix</w:t>
+            </w:r>
+          </w:p>
+        </w:tc>
+        <w:tc>
+          <w:tcPr>
+            <w:tcW w:type="dxa" w:w="2880"/>
+          </w:tcPr>
+          <w:p>
+            <w:r>
+              <w:t>Visuel du festival Les 7 Jours du 7ᵉ Art, photo de vous en ambassadeur ; « 315 films, 5 continents » ; photo de la soirée théâtre de Mamou</w:t>
+            </w:r>
+          </w:p>
+        </w:tc>
+      </w:tr>
+      <w:tr>
+        <w:tc>
+          <w:tcPr>
+            <w:tcW w:type="dxa" w:w="2880"/>
+          </w:tcPr>
+          <w:p>
+            <w:r>
+              <w:t>7</w:t>
+            </w:r>
+          </w:p>
+        </w:tc>
+        <w:tc>
+          <w:tcPr>
+            <w:tcW w:type="dxa" w:w="2880"/>
+          </w:tcPr>
+          <w:p>
+            <w:r>
               <w:t>Ce que nous avons appris</w:t>
             </w:r>
           </w:p>
@@ -1685,7 +2099,7 @@
           </w:tcPr>
           <w:p>
             <w:r>
-              <w:t>7</w:t>
+              <w:t>8</w:t>
             </w:r>
           </w:p>
         </w:tc>
@@ -1705,7 +2119,7 @@
           </w:tcPr>
           <w:p>
             <w:r>
-              <w:t>Les 5 propositions pour la région</w:t>
+              <w:t>Les 6 propositions pour la région</w:t>
             </w:r>
           </w:p>
         </w:tc>
@@ -1717,7 +2131,7 @@
           </w:tcPr>
           <w:p>
             <w:r>
-              <w:t>8</w:t>
+              <w:t>9</w:t>
             </w:r>
           </w:p>
         </w:tc>
@@ -1754,7 +2168,7 @@
         <w:rPr>
           <w:color w:val="6A1B9A"/>
         </w:rPr>
-        <w:t>6. Questions possibles et éléments de réponse</w:t>
+        <w:t>7. Questions possibles et éléments de réponse</w:t>
       </w:r>
       <w:r>
         <w:rPr>
@@ -1796,6 +2210,28 @@
                 <w:b/>
               </w:rPr>
               <w:t>Éléments de réponse</w:t>
+            </w:r>
+          </w:p>
+        </w:tc>
+      </w:tr>
+      <w:tr>
+        <w:tc>
+          <w:tcPr>
+            <w:tcW w:type="dxa" w:w="4320"/>
+          </w:tcPr>
+          <w:p>
+            <w:r>
+              <w:t>Que fait concrètement un ambassadeur du festival Les 7 Jours du 7ᵉ Art ?</w:t>
+            </w:r>
+          </w:p>
+        </w:tc>
+        <w:tc>
+          <w:tcPr>
+            <w:tcW w:type="dxa" w:w="4320"/>
+          </w:tcPr>
+          <w:p>
+            <w:r>
+              <w:t>[À compléter : votre rôle, vos actions, par exemple la mobilisation du public, des partenaires ou des débats sur la paix et le genre]</w:t>
             </w:r>
           </w:p>
         </w:tc>
@@ -1906,7 +2342,7 @@
         <w:rPr>
           <w:color w:val="6A1B9A"/>
         </w:rPr>
-        <w:t>7. Publications pour les réseaux sociaux</w:t>
+        <w:t>8. Publications pour les réseaux sociaux</w:t>
       </w:r>
       <w:r>
         <w:rPr>
@@ -1991,7 +2427,7 @@
           </w:tcPr>
           <w:p>
             <w:r>
-              <w:t>Radio, table ronde, lieu de culte, théâtre, dialogue entre générations : plus de 180 personnes mobilisées à Mamou, et une distinction à Marrakech parmi 118 ONG de 43 pays au #YESAfrica 2025. Merci à nos équipes et à nos partenaires ! #DeSomoneADakar #FinDesVBG</w:t>
+              <w:t>Radio, table ronde, lieu de culte, théâtre, dialogue entre générations : plus de 180 personnes mobilisées à Mamou, une distinction à Marrakech parmi 118 ONG de 43 pays au #YESAfrica 2025, et le cinéma comme outil de paix avec le festival Les 7 Jours du 7ᵉ Art. Merci à nos équipes et à nos partenaires ! #DeSomoneADakar #FinDesVBG</w:t>
             </w:r>
           </w:p>
         </w:tc>

</xml_diff>

<commit_message>
Ajout du titre de Champion de la jeunesse africaine reçu au YES Africa 2025
Co-Authored-By: Claude Opus 5.5 <noreply@anthropic.com>
Claude-Session: https://claude.ai/code/session_01Y44voEEgrqkDtN5faKYhcF
</commit_message>
<xml_diff>
--- a/Communication_Guinee_Impact_Forum_Dakar_2026.docx
+++ b/Communication_Guinee_Impact_Forum_Dakar_2026.docx
@@ -164,7 +164,7 @@
               <w:t>re</w:t>
             </w:r>
             <w:r>
-              <w:t xml:space="preserve"> édition à Somone, avec ses équipes et ses partenaires, la distinction reçue au Youth Empowerment Summit – YES Africa 2025 à Marrakech, et son rôle d’ambassadeur du festival de cinéma « Les 7 Jours du 7ᵉ Art »</w:t>
+              <w:t xml:space="preserve"> édition à Somone, avec ses équipes et ses partenaires, la distinction de « Champion de la jeunesse africaine sur le droit des jeunes et leur implication dans les instances de prise de décision » reçue au Youth Empowerment Summit – YES Africa 2025 à Marrakech, et son rôle d’ambassadeur du festival de cinéma « Les 7 Jours du 7ᵉ Art »</w:t>
             </w:r>
           </w:p>
         </w:tc>
@@ -207,16 +207,7 @@
         <w:t>À compléter (en rouge dans le texte) :</w:t>
       </w:r>
       <w:r>
-        <w:t xml:space="preserve"> année de création et mission de Guinée Impact ; </w:t>
-      </w:r>
-      <w:r>
-        <w:rPr>
-          <w:b/>
-        </w:rPr>
-        <w:t>nom exact de la distinction</w:t>
-      </w:r>
-      <w:r>
-        <w:t xml:space="preserve"> reçue au YES Africa Summit et son motif ; autres activités menées depuis Somone ; </w:t>
+        <w:t xml:space="preserve"> année de création et mission de Guinée Impact ; autres activités menées depuis Somone ; </w:t>
       </w:r>
       <w:r>
         <w:rPr>
@@ -225,7 +216,7 @@
         <w:t>édition du festival Les 7 Jours du 7ᵉ Art</w:t>
       </w:r>
       <w:r>
-        <w:t xml:space="preserve"> dont vous êtes ambassadeur et ce que vous y avez fait. Les informations sur le sommet et le festival viennent de sources publiques (sections 4 et 5). En revanche, je n’ai trouvé aucune source publique sur la distinction de Guinée Impact : son nom et son motif doivent venir de vous.</w:t>
+        <w:t xml:space="preserve"> dont vous êtes ambassadeur et ce que vous y avez fait. Les informations sur le sommet et le festival viennent de sources publiques (sections 4 et 5). Le titre de la distinction vient de vous : je n’en ai pas trouvé de trace publique. Si vous avez un certificat, une photo ou un article, montrez-le sur la diapositive.</w:t>
       </w:r>
       <w:r/>
     </w:p>
@@ -327,7 +318,7 @@
         <w:t>Une reconnaissance internationale, fruit d’un travail d’équipe.</w:t>
       </w:r>
       <w:r>
-        <w:t xml:space="preserve"> La distinction reçue au Youth Empowerment Summit – YES Africa 2025, à Marrakech, parmi 118 ONG de 43 pays africains, appartient aux équipes, aux partenaires et aux femmes et jeunes avec qui nous travaillons.</w:t>
+        <w:t xml:space="preserve"> Le titre de « Champion de la jeunesse africaine sur le droit des jeunes et leur implication dans les instances de prise de décision », reçu au Youth Empowerment Summit – YES Africa 2025 à Marrakech, parmi 118 ONG de 43 pays africains, appartient aux équipes, aux partenaires et aux femmes et jeunes avec qui nous travaillons.</w:t>
       </w:r>
       <w:r/>
     </w:p>
@@ -564,7 +555,7 @@
         <w:t>19 et 20 juin 2025, Marrakech</w:t>
       </w:r>
       <w:r>
-        <w:t xml:space="preserve"> : Guinée Impact est distinguée au premier Youth Empowerment Summit – YES Africa.</w:t>
+        <w:t xml:space="preserve"> : au premier Youth Empowerment Summit – YES Africa, je suis distingué « Champion de la jeunesse africaine » sur le droit des jeunes et leur implication dans les instances de prise de décision.</w:t>
       </w:r>
       <w:r/>
     </w:p>
@@ -719,20 +710,21 @@
         <w:t>Youth Empowerment Summit – YES Africa</w:t>
       </w:r>
       <w:r>
-        <w:t xml:space="preserve">, co-organisé par la Fondation Jadara et l’Union Panafricaine de la Jeunesse. Plus de 1 000 jeunes leaders et représentant·es de 118 ONG de 43 pays africains y ont travaillé sur l’avenir de la jeunesse africaine, en particulier des jeunes sans emploi, hors de l’école ou sans formation. C’est dans ce cadre que Guinée Impact a reçu </w:t>
-      </w:r>
-      <w:r>
-        <w:t>[nom exact de la distinction]</w:t>
-      </w:r>
-      <w:r>
-        <w:t>.</w:t>
+        <w:t>, co-organisé par la Fondation Jadara et l’Union Panafricaine de la Jeunesse. Plus de 1 000 jeunes leaders et représentant·es de 118 ONG de 43 pays africains y ont travaillé sur l’avenir de la jeunesse africaine, en particulier des jeunes sans emploi, hors de l’école ou sans formation. C’est dans ce cadre que j’ai été distingué « Champion de la jeunesse africaine sur le droit des jeunes et leur implication dans les instances de prise de décision ».</w:t>
       </w:r>
       <w:r/>
     </w:p>
     <w:p>
       <w:r/>
       <w:r>
-        <w:t>J’ai eu l’honneur de la recevoir, mais cette distinction ne m’appartient pas. Elle appartient à nos équipes, qui ont travaillé souvent avec peu de moyens. Elle appartient aux femmes leaders de Mamou qui ont pris la parole, aux leaders religieux qui ont accepté d’ouvrir le dialogue, et aux jeunes qui se sont engagé·es. Elle montre surtout qu’une organisation guinéenne de terrain peut être reconnue à l’échelle du continent. Et Marrakech nous a rappelé une chose : il n’y a pas de paix durable pour les femmes et les jeunes sans autonomie économique, un point que nos collègues avaient déjà soulevé à Somone. Et c’est un message pour chacune et chacun d’entre vous : votre travail compte, et il peut être vu.</w:t>
+        <w:t>Ce titre a un sens particulier ici. À Somone, nous avons demandé une participation significative des jeunes dans les instances de décision et l’autonomisation des conseils nationaux de jeunesse. Cette distinction montre que ce combat est entendu à l’échelle du continent. Mais un titre ne suffit pas : ce qui compte, c’est que les jeunes, et en particulier les jeunes femmes, siègent réellement là où les décisions se prennent.</w:t>
+      </w:r>
+      <w:r/>
+    </w:p>
+    <w:p>
+      <w:r/>
+      <w:r>
+        <w:t>J’ai eu l’honneur de recevoir ce titre, mais il ne m’appartient pas. Il appartient à nos équipes, qui ont travaillé souvent avec peu de moyens. Il appartient aux femmes leaders de Mamou qui ont pris la parole, aux leaders religieux qui ont accepté d’ouvrir le dialogue, et aux jeunes qui se sont engagé·es. Il montre surtout qu’une organisation guinéenne de terrain peut être reconnue à l’échelle du continent. Et Marrakech nous a rappelé une chose : il n’y a pas de paix durable pour les femmes et les jeunes sans autonomie économique, un point que nos collègues avaient déjà soulevé à Somone. Et c’est un message pour chacune et chacun d’entre vous : votre travail compte, et il peut être vu.</w:t>
       </w:r>
       <w:r/>
     </w:p>
@@ -2023,7 +2015,7 @@
           </w:tcPr>
           <w:p>
             <w:r>
-              <w:t>Photo de la remise de la distinction, nom exact ; « 1 000 jeunes leaders, 118 ONG, 43 pays » ; mention « Une reconnaissance collective »</w:t>
+              <w:t>Photo de la remise, titre « Champion de la jeunesse africaine sur le droit des jeunes et leur implication dans les instances de prise de décision », certificat si disponible ; « 1 000 jeunes leaders, 118 ONG, 43 pays » ; mention « Une reconnaissance collective »</w:t>
             </w:r>
           </w:p>
         </w:tc>
@@ -2243,7 +2235,7 @@
           </w:tcPr>
           <w:p>
             <w:r>
-              <w:t>Pour quoi Guinée Impact a-t-elle été distinguée au Maroc ?</w:t>
+              <w:t>Pourquoi avez-vous été distingué Champion de la jeunesse africaine ?</w:t>
             </w:r>
           </w:p>
         </w:tc>
@@ -2253,7 +2245,32 @@
           </w:tcPr>
           <w:p>
             <w:r>
-              <w:t>[À compléter : critères ou motif de la distinction]</w:t>
+              <w:t xml:space="preserve">Pour l’engagement en faveur du droit des jeunes et de leur implication dans les instances de prise de décision. </w:t>
+            </w:r>
+            <w:r>
+              <w:t>[Ajouter 1 ou 2 exemples concrets : jeunes accompagné·es, plaidoyer mené, instances où des jeunes siègent grâce à votre action.]</w:t>
+            </w:r>
+          </w:p>
+        </w:tc>
+      </w:tr>
+      <w:tr>
+        <w:tc>
+          <w:tcPr>
+            <w:tcW w:type="dxa" w:w="4320"/>
+          </w:tcPr>
+          <w:p>
+            <w:r>
+              <w:t>Comment ce titre sert-il les jeunes femmes ?</w:t>
+            </w:r>
+          </w:p>
+        </w:tc>
+        <w:tc>
+          <w:tcPr>
+            <w:tcW w:type="dxa" w:w="4320"/>
+          </w:tcPr>
+          <w:p>
+            <w:r>
+              <w:t>Le droit des jeunes à décider inclut celui des jeunes femmes, souvent doublement exclues. Exemples : la table ronde et les dialogues intergénérationnels de Mamou, qui préparent les jeunes femmes à se positionner dans les instances.</w:t>
             </w:r>
           </w:p>
         </w:tc>
@@ -2427,7 +2444,7 @@
           </w:tcPr>
           <w:p>
             <w:r>
-              <w:t>Radio, table ronde, lieu de culte, théâtre, dialogue entre générations : plus de 180 personnes mobilisées à Mamou, une distinction à Marrakech parmi 118 ONG de 43 pays au #YESAfrica 2025, et le cinéma comme outil de paix avec le festival Les 7 Jours du 7ᵉ Art. Merci à nos équipes et à nos partenaires ! #DeSomoneADakar #FinDesVBG</w:t>
+              <w:t>Radio, table ronde, lieu de culte, théâtre, dialogue entre générations : plus de 180 personnes mobilisées à Mamou, le titre de Champion de la jeunesse africaine pour le droit des jeunes à participer aux décisions, reçu à Marrakech au #YESAfrica 2025, et le cinéma comme outil de paix avec le festival Les 7 Jours du 7ᵉ Art. Merci à nos équipes et à nos partenaires ! #DeSomoneADakar #FinDesVBG</w:t>
             </w:r>
           </w:p>
         </w:tc>

</xml_diff>

<commit_message>
Ajout de l'intervention au panel YES Africa, de la 6e édition du festival et des photos
Co-Authored-By: Claude Opus 5.5 <noreply@anthropic.com>
Claude-Session: https://claude.ai/code/session_01Y44voEEgrqkDtN5faKYhcF
</commit_message>
<xml_diff>
--- a/Communication_Guinee_Impact_Forum_Dakar_2026.docx
+++ b/Communication_Guinee_Impact_Forum_Dakar_2026.docx
@@ -77,7 +77,7 @@
               <w:rPr>
                 <w:b/>
               </w:rPr>
-              <w:t>Mamadou BARRY</w:t>
+              <w:t>Mamadou Adama BARRY</w:t>
             </w:r>
             <w:r>
               <w:t xml:space="preserve"> , Président de Guinée Impact</w:t>
@@ -189,7 +189,7 @@
           </w:tcPr>
           <w:p>
             <w:r>
-              <w:t>Rapport d’activités de Guinée Impact à Mamou (janvier 2025) ; rapport annuel 2024 du GTFJPS-AOS/GN ; stratégie d’action validée à Somone ; informations fournies par Mamadou BARRY ; sources publiques sur le YES Africa Summit et le festival Les 7 Jours du 7ᵉ Art (voir sections 4 et 5)</w:t>
+              <w:t>Rapport d’activités de Guinée Impact à Mamou (janvier 2025) ; rapport annuel 2024 du GTFJPS-AOS/GN ; stratégie d’action validée à Somone ; informations fournies par Mamadou Adama BARRY ; sources publiques sur le YES Africa Summit et le festival Les 7 Jours du 7ᵉ Art (voir sections 4 et 5)</w:t>
             </w:r>
           </w:p>
         </w:tc>
@@ -207,16 +207,16 @@
         <w:t>À compléter (en rouge dans le texte) :</w:t>
       </w:r>
       <w:r>
-        <w:t xml:space="preserve"> année de création et mission de Guinée Impact ; autres activités menées depuis Somone ; </w:t>
+        <w:t xml:space="preserve"> année de création et mission de Guinée Impact ; autres activités menées depuis Somone ; ce que vous avez fait comme ambassadeur de la 6ᵉ édition du festival Les 7 Jours du 7ᵉ Art. Les informations sur le sommet et le festival viennent de sources publiques (sections 4 et 5). Le titre de la distinction vient de vous. Vos photos (trophée YES Africa, visuel du panel, salle plénière) sont enregistrées dans le dossier </w:t>
       </w:r>
       <w:r>
         <w:rPr>
-          <w:b/>
+          <w:i/>
         </w:rPr>
-        <w:t>édition du festival Les 7 Jours du 7ᵉ Art</w:t>
+        <w:t>images</w:t>
       </w:r>
       <w:r>
-        <w:t xml:space="preserve"> dont vous êtes ambassadeur et ce que vous y avez fait. Les informations sur le sommet et le festival viennent de sources publiques (sections 4 et 5). Le titre de la distinction vient de vous : je n’en ai pas trouvé de trace publique. Si vous avez un certificat, une photo ou un article, montrez-le sur la diapositive.</w:t>
+        <w:t xml:space="preserve"> pour les diapositives.</w:t>
       </w:r>
       <w:r/>
     </w:p>
@@ -398,7 +398,7 @@
     <w:p>
       <w:r/>
       <w:r>
-        <w:t xml:space="preserve">Je m’appelle Mamadou BARRY, Président de </w:t>
+        <w:t xml:space="preserve">Je m’appelle Mamadou Adama BARRY, Président de </w:t>
       </w:r>
       <w:r>
         <w:rPr>
@@ -528,16 +528,10 @@
         <w:rPr>
           <w:b/>
         </w:rPr>
-        <w:t>[Année]</w:t>
+        <w:t>Décembre 2024, Conakry</w:t>
       </w:r>
       <w:r>
-        <w:rPr>
-          <w:b/>
-        </w:rPr>
-        <w:t>, Conakry</w:t>
-      </w:r>
-      <w:r>
-        <w:t xml:space="preserve"> : je deviens ambassadeur du festival de cinéma Les 7 Jours du 7ᵉ Art.</w:t>
+        <w:t xml:space="preserve"> : je suis ambassadeur de la 6ᵉ édition du festival de cinéma Les 7 Jours du 7ᵉ Art.</w:t>
       </w:r>
       <w:r/>
     </w:p>
@@ -581,7 +575,7 @@
     <w:p>
       <w:r/>
       <w:r>
-        <w:t>Mamou : cinq jours, cinq façons de parler aux communautés (2 minutes 30)</w:t>
+        <w:t>Mamou : cinq jours, cinq façons de parler aux communautés (2 minutes)</w:t>
       </w:r>
       <w:r/>
     </w:p>
@@ -694,7 +688,7 @@
     <w:p>
       <w:r/>
       <w:r>
-        <w:t>Une reconnaissance internationale (1 minute)</w:t>
+        <w:t>Une reconnaissance internationale (1 minute 30)</w:t>
       </w:r>
       <w:r/>
     </w:p>
@@ -711,6 +705,22 @@
       </w:r>
       <w:r>
         <w:t>, co-organisé par la Fondation Jadara et l’Union Panafricaine de la Jeunesse. Plus de 1 000 jeunes leaders et représentant·es de 118 ONG de 43 pays africains y ont travaillé sur l’avenir de la jeunesse africaine, en particulier des jeunes sans emploi, hors de l’école ou sans formation. C’est dans ce cadre que j’ai été distingué « Champion de la jeunesse africaine sur le droit des jeunes et leur implication dans les instances de prise de décision ».</w:t>
+      </w:r>
+      <w:r/>
+    </w:p>
+    <w:p>
+      <w:r/>
+      <w:r>
+        <w:t xml:space="preserve">J’y ai aussi pris la parole comme intervenant de la conférence </w:t>
+      </w:r>
+      <w:r>
+        <w:rPr>
+          <w:i/>
+        </w:rPr>
+        <w:t>« Cultiver la résilience face au changement climatique : l’agriculture et l’agroalimentaire, piliers de la sécurité alimentaire et leviers d’innovation pour la jeunesse africaine »</w:t>
+      </w:r>
+      <w:r>
+        <w:t>, aux côtés d’expert·es du Malawi, du Maroc et du Bénin, en tant que leader de l’agroécologie et de l’autonomisation des jeunes. Ce n’est pas un sujet éloigné du nôtre : quand la terre s’épuise et que les récoltes manquent, les tensions montent, et ce sont souvent les femmes et les jeunes qui en paient le prix. La sécurité alimentaire fait partie de la paix.</w:t>
       </w:r>
       <w:r/>
     </w:p>
@@ -738,7 +748,7 @@
     <w:p>
       <w:r/>
       <w:r>
-        <w:t xml:space="preserve">Je suis également ambassadeur du festival </w:t>
+        <w:t xml:space="preserve">J’ai également été ambassadeur de la 6ᵉ édition du festival </w:t>
       </w:r>
       <w:r>
         <w:rPr>
@@ -747,13 +757,7 @@
         <w:t>Les 7 Jours du 7ᵉ Art</w:t>
       </w:r>
       <w:r>
-        <w:t xml:space="preserve">, </w:t>
-      </w:r>
-      <w:r>
-        <w:t>[édition / depuis quelle année]</w:t>
-      </w:r>
-      <w:r>
-        <w:t>. Chaque année en décembre, à Conakry, ce festival fait vivre le cinéma guinéen et ouvre aux jeunes cinéastes des occasions de se former, de diffuser leurs films et de coproduire. Sa 7ᵉ édition, du 6 au 12 décembre 2025, avait pour thème « L’Encre et l’Écran » et a reçu plus de 315 films venus d’Afrique, d’Europe, d’Asie, d’Amérique et du Moyen-Orient.</w:t>
+        <w:t>, en décembre 2024. Chaque année en décembre, à Conakry, ce festival fait vivre le cinéma guinéen et ouvre aux jeunes cinéastes des occasions de se former, de diffuser leurs films et de coproduire. Sa 7ᵉ édition, du 6 au 12 décembre 2025, avait pour thème « L’Encre et l’Écran » et a reçu plus de 315 films venus d’Afrique, d’Europe, d’Asie, d’Amérique et du Moyen-Orient.</w:t>
       </w:r>
       <w:r/>
     </w:p>
@@ -1418,6 +1422,37 @@
           </w:tcPr>
           <w:p>
             <w:r>
+              <w:t>Intervention de Mamadou Adama BARRY</w:t>
+            </w:r>
+          </w:p>
+        </w:tc>
+        <w:tc>
+          <w:tcPr>
+            <w:tcW w:type="dxa" w:w="4320"/>
+          </w:tcPr>
+          <w:p>
+            <w:r>
+              <w:t xml:space="preserve">Intervenant de la conférence « Cultivating Resilience to Climate Change: Agriculture and the Agri-food Industry as Pillars of Food Security and Innovation Levers for African Youth », présenté comme </w:t>
+            </w:r>
+            <w:r>
+              <w:rPr>
+                <w:i/>
+              </w:rPr>
+              <w:t>Agroecology &amp; Youth Empowerment Leader, Guinea</w:t>
+            </w:r>
+            <w:r>
+              <w:t xml:space="preserve"> (source : visuel officiel et publication YES Africa)</w:t>
+            </w:r>
+          </w:p>
+        </w:tc>
+      </w:tr>
+      <w:tr>
+        <w:tc>
+          <w:tcPr>
+            <w:tcW w:type="dxa" w:w="4320"/>
+          </w:tcPr>
+          <w:p>
+            <w:r>
               <w:t>Thèmes</w:t>
             </w:r>
           </w:p>
@@ -1887,7 +1922,7 @@
           </w:tcPr>
           <w:p>
             <w:r>
-              <w:t>« De Somone à Dakar : le parcours de Guinée Impact », logo, Mamadou BARRY, Président</w:t>
+              <w:t>« De Somone à Dakar : le parcours de Guinée Impact », logo, Mamadou Adama BARRY, Président</w:t>
             </w:r>
           </w:p>
         </w:tc>
@@ -2015,7 +2050,34 @@
           </w:tcPr>
           <w:p>
             <w:r>
-              <w:t>Photo de la remise, titre « Champion de la jeunesse africaine sur le droit des jeunes et leur implication dans les instances de prise de décision », certificat si disponible ; « 1 000 jeunes leaders, 118 ONG, 43 pays » ; mention « Une reconnaissance collective »</w:t>
+              <w:t xml:space="preserve">Photo du trophée ( </w:t>
+            </w:r>
+            <w:r>
+              <w:rPr>
+                <w:i/>
+              </w:rPr>
+              <w:t>images/yes_africa_trophee.webp</w:t>
+            </w:r>
+            <w:r>
+              <w:t xml:space="preserve"> ), titre « Champion de la jeunesse africaine sur le droit des jeunes et leur implication dans les instances de prise de décision » ; visuel du panel agriculture et climat ( </w:t>
+            </w:r>
+            <w:r>
+              <w:rPr>
+                <w:i/>
+              </w:rPr>
+              <w:t>images/yes_africa_panel_agriculture.webp</w:t>
+            </w:r>
+            <w:r>
+              <w:t xml:space="preserve"> ) ; photo de la salle plénière ( </w:t>
+            </w:r>
+            <w:r>
+              <w:rPr>
+                <w:i/>
+              </w:rPr>
+              <w:t>images/yes_africa_salle_pleniere.webp</w:t>
+            </w:r>
+            <w:r>
+              <w:t xml:space="preserve"> ) ; « 1 000 jeunes leaders, 118 ONG, 43 pays » ; mention « Une reconnaissance collective »</w:t>
             </w:r>
           </w:p>
         </w:tc>
@@ -2202,6 +2264,28 @@
                 <w:b/>
               </w:rPr>
               <w:t>Éléments de réponse</w:t>
+            </w:r>
+          </w:p>
+        </w:tc>
+      </w:tr>
+      <w:tr>
+        <w:tc>
+          <w:tcPr>
+            <w:tcW w:type="dxa" w:w="4320"/>
+          </w:tcPr>
+          <w:p>
+            <w:r>
+              <w:t>Quel lien entre agroécologie et paix ?</w:t>
+            </w:r>
+          </w:p>
+        </w:tc>
+        <w:tc>
+          <w:tcPr>
+            <w:tcW w:type="dxa" w:w="4320"/>
+          </w:tcPr>
+          <w:p>
+            <w:r>
+              <w:t>La raréfaction des terres et de l’eau, aggravée par le changement climatique, alimente les conflits locaux (entre agriculteur·rices et éleveur·ses, pour l’accès aux ressources). Les femmes, très présentes dans l’agriculture, sont en première ligne. Former les jeunes à l’agroécologie, c’est prévenir les conflits et créer des emplois.</w:t>
             </w:r>
           </w:p>
         </w:tc>
@@ -2422,7 +2506,7 @@
           </w:tcPr>
           <w:p>
             <w:r>
-              <w:t>🇬🇳 Aujourd’hui à #DeSomoneADakar, Mamadou BARRY, Président de Guinée Impact, présente notre parcours depuis Somone : de Mamou au Youth Empowerment Summit – YES Africa 2025 à Marrakech. Un travail d’équipe au service des femmes et des jeunes. #Femmes1325 #Jeunes2250</w:t>
+              <w:t>🇬🇳 Aujourd’hui à #DeSomoneADakar, Mamadou Adama BARRY, Président de Guinée Impact, présente notre parcours depuis Somone : de Mamou au Youth Empowerment Summit – YES Africa 2025 à Marrakech. Un travail d’équipe au service des femmes et des jeunes. #Femmes1325 #Jeunes2250</w:t>
             </w:r>
           </w:p>
         </w:tc>

</xml_diff>

<commit_message>
Diapositives du forum de Dakar au style Guinée Impact, parcours complété à partir des rapports
Co-Authored-By: Claude Opus 5.5 <noreply@anthropic.com>
Claude-Session: https://claude.ai/code/session_01Y44voEEgrqkDtN5faKYhcF
</commit_message>
<xml_diff>
--- a/Communication_Guinee_Impact_Forum_Dakar_2026.docx
+++ b/Communication_Guinee_Impact_Forum_Dakar_2026.docx
@@ -130,7 +130,7 @@
           </w:tcPr>
           <w:p>
             <w:r>
-              <w:t>10 minutes, puis questions</w:t>
+              <w:t>10 à 11 minutes, puis questions</w:t>
             </w:r>
           </w:p>
         </w:tc>
@@ -207,7 +207,7 @@
         <w:t>À compléter (en rouge dans le texte) :</w:t>
       </w:r>
       <w:r>
-        <w:t xml:space="preserve"> année de création et mission de Guinée Impact ; autres activités menées depuis Somone ; ce que vous avez fait comme ambassadeur de la 6ᵉ édition du festival Les 7 Jours du 7ᵉ Art. Les informations sur le sommet et le festival viennent de sources publiques (sections 4 et 5). Le titre de la distinction vient de vous. Vos photos (trophée YES Africa, visuel du panel, salle plénière) sont enregistrées dans le dossier </w:t>
+        <w:t xml:space="preserve"> ce que vous avez fait comme ambassadeur de la 6ᵉ édition du festival Les 7 Jours du 7ᵉ Art. Les informations sur le sommet et le festival viennent de sources publiques (sections 4 et 5). Le titre de la distinction vient de vous. Vos photos (trophée YES Africa, visuel du panel, salle plénière) sont enregistrées dans le dossier </w:t>
       </w:r>
       <w:r>
         <w:rPr>
@@ -428,13 +428,7 @@
     <w:p>
       <w:r/>
       <w:r>
-        <w:t xml:space="preserve">Guinée Impact est </w:t>
-      </w:r>
-      <w:r>
-        <w:t>[année de création, mission, zones d’intervention, en une ou deux phrases]</w:t>
-      </w:r>
-      <w:r>
-        <w:t>.</w:t>
+        <w:t>Guinée Impact est une plateforme de la société civile guinéenne, basée à Conakry. Notre mission : promouvoir une gouvernance responsable, renforcer la participation citoyenne et accompagner les initiatives qui favorisent la paix, l’inclusion sociale, le leadership et l’autonomisation des jeunes et des femmes. Nous travaillons avec les institutions publiques, les collectivités locales, la société civile, le secteur privé et les partenaires au développement.</w:t>
       </w:r>
       <w:r/>
     </w:p>
@@ -457,14 +451,14 @@
     <w:p>
       <w:r/>
       <w:r>
-        <w:t>De Somone à Dakar : notre parcours (1 minute)</w:t>
+        <w:t>Notre parcours en dates (1 minute 30)</w:t>
       </w:r>
       <w:r/>
     </w:p>
     <w:p>
       <w:r/>
       <w:r>
-        <w:t>En quelques dates :</w:t>
+        <w:t>Avec notre Groupe de Travail et nos partenaires, voici le chemin parcouru :</w:t>
       </w:r>
       <w:r/>
       <w:r/>
@@ -480,10 +474,10 @@
         <w:rPr>
           <w:b/>
         </w:rPr>
-        <w:t>Somone</w:t>
+        <w:t>Juillet 2024, Conakry</w:t>
       </w:r>
       <w:r>
-        <w:t xml:space="preserve"> : avec les autres pays de notre groupe, nous nous engageons à faire connaître les lois et politiques sur les droits des femmes et l’agenda Jeunes, Paix et Sécurité, et à renforcer notre plaidoyer.</w:t>
+        <w:t xml:space="preserve"> : nous validons les indicateurs d’une plateforme numérique de suivi de la participation des filles et des femmes aux mécanismes de paix, et nous formons 20 mouvements politiques et organisations de la société civile au civisme, à la médiation et à l’alerte précoce.</w:t>
       </w:r>
       <w:r/>
     </w:p>
@@ -498,10 +492,10 @@
         <w:rPr>
           <w:b/>
         </w:rPr>
-        <w:t>Janvier 2025, Mamou</w:t>
+        <w:t>Août 2024</w:t>
       </w:r>
       <w:r>
-        <w:t xml:space="preserve"> : nous portons la stratégie nationale de plaidoyer sur la participation des filles et des femmes jusqu’aux communautés.</w:t>
+        <w:t xml:space="preserve"> : une stratégie nationale de plaidoyer voit le jour, construite à partir des plans locaux de 11 zones du projet FIFEP.</w:t>
       </w:r>
       <w:r/>
     </w:p>
@@ -513,7 +507,31 @@
       </w:pPr>
       <w:r/>
       <w:r>
-        <w:t>[Autres activités menées depuis Somone : date, lieu, résultat]</w:t>
+        <w:rPr>
+          <w:b/>
+        </w:rPr>
+        <w:t>2024, Accra</w:t>
+      </w:r>
+      <w:r>
+        <w:t xml:space="preserve"> : nous partageons notre expérience à la réunion annuelle du Groupe de Travail sous-régional.</w:t>
+      </w:r>
+      <w:r/>
+    </w:p>
+    <w:p>
+      <w:pPr>
+        <w:pStyle w:val="ListBullet"/>
+        <w:spacing w:line="240" w:lineRule="auto"/>
+        <w:ind w:left="720"/>
+      </w:pPr>
+      <w:r/>
+      <w:r>
+        <w:rPr>
+          <w:b/>
+        </w:rPr>
+        <w:t>Octobre 2024</w:t>
+      </w:r>
+      <w:r>
+        <w:t xml:space="preserve"> : nous renforçons notre partenariat avec CARE International.</w:t>
       </w:r>
       <w:r/>
     </w:p>
@@ -532,6 +550,24 @@
       </w:r>
       <w:r>
         <w:t xml:space="preserve"> : je suis ambassadeur de la 6ᵉ édition du festival de cinéma Les 7 Jours du 7ᵉ Art.</w:t>
+      </w:r>
+      <w:r/>
+    </w:p>
+    <w:p>
+      <w:pPr>
+        <w:pStyle w:val="ListBullet"/>
+        <w:spacing w:line="240" w:lineRule="auto"/>
+        <w:ind w:left="720"/>
+      </w:pPr>
+      <w:r/>
+      <w:r>
+        <w:rPr>
+          <w:b/>
+        </w:rPr>
+        <w:t>Janvier 2025, Mamou</w:t>
+      </w:r>
+      <w:r>
+        <w:t xml:space="preserve"> : nous portons la stratégie nationale de plaidoyer jusqu’aux communautés.</w:t>
       </w:r>
       <w:r/>
     </w:p>
@@ -1986,7 +2022,7 @@
           </w:tcPr>
           <w:p>
             <w:r>
-              <w:t>Frise : Somone → Mamou (janvier 2025) → Marrakech (juin 2025) → Dakar (2026)</w:t>
+              <w:t>Frise : juillet 2024 (indicateurs, formation) → août 2024 (stratégie de plaidoyer) → décembre 2024 (festival) → janvier 2025 (Mamou) → juin 2025 (Marrakech) → Dakar 2026</w:t>
             </w:r>
           </w:p>
         </w:tc>

</xml_diff>

<commit_message>
Ajout des actions menées comme ambassadeur du festival Les 7 Jours du 7e Art
Co-Authored-By: Claude Opus 5.5 <noreply@anthropic.com>
Claude-Session: https://claude.ai/code/session_01Y44voEEgrqkDtN5faKYhcF
</commit_message>
<xml_diff>
--- a/Communication_Guinee_Impact_Forum_Dakar_2026.docx
+++ b/Communication_Guinee_Impact_Forum_Dakar_2026.docx
@@ -130,7 +130,7 @@
           </w:tcPr>
           <w:p>
             <w:r>
-              <w:t>10 à 11 minutes, puis questions</w:t>
+              <w:t>11 minutes environ, puis questions</w:t>
             </w:r>
           </w:p>
         </w:tc>
@@ -204,10 +204,10 @@
         <w:rPr>
           <w:b/>
         </w:rPr>
-        <w:t>À compléter (en rouge dans le texte) :</w:t>
+        <w:t>Sources :</w:t>
       </w:r>
       <w:r>
-        <w:t xml:space="preserve"> ce que vous avez fait comme ambassadeur de la 6ᵉ édition du festival Les 7 Jours du 7ᵉ Art. Les informations sur le sommet et le festival viennent de sources publiques (sections 4 et 5). Le titre de la distinction vient de vous. Vos photos (trophée YES Africa, visuel du panel, salle plénière) sont enregistrées dans le dossier </w:t>
+        <w:t xml:space="preserve"> les informations sur le sommet et le festival viennent de sources publiques (sections 4 et 5). Le titre de la distinction vient de vous. Vos photos (trophée YES Africa, visuel du panel, salle plénière) sont enregistrées dans le dossier </w:t>
       </w:r>
       <w:r>
         <w:rPr>
@@ -777,7 +777,7 @@
     <w:p>
       <w:r/>
       <w:r>
-        <w:t>La culture au service de la paix : le cinéma (1 minute)</w:t>
+        <w:t>La culture au service de la paix : le cinéma (1 minute 30)</w:t>
       </w:r>
       <w:r/>
     </w:p>
@@ -800,10 +800,98 @@
     <w:p>
       <w:r/>
       <w:r>
-        <w:t xml:space="preserve">Pourquoi un défenseur de la paix s’engage-t-il dans un festival de cinéma ? Parce qu’à Mamou, nous avons vu qu’une pièce de théâtre en langue locale touche plus de monde qu’un long discours. Le cinéma, c’est la même force, avec une portée encore plus grande. Les projections en plein air, les débats et les ateliers du festival sont des espaces où l’on peut parler des droits des femmes, des violences et de la paix avec le grand public, et surtout avec les jeunes. </w:t>
+        <w:t>Pourquoi un défenseur de la paix s’engage-t-il dans un festival de cinéma ? Parce qu’à Mamou, nous avons vu qu’une pièce de théâtre en langue locale touche plus de monde qu’un long discours. Le cinéma, c’est la même force, avec une portée encore plus grande. Les projections en plein air, les débats et les ateliers du festival sont des espaces où l’on peut parler des droits des femmes, des violences et de la paix avec le grand public, et surtout avec les jeunes.</w:t>
+      </w:r>
+      <w:r/>
+    </w:p>
+    <w:p>
+      <w:r/>
+      <w:r>
+        <w:t>Comme ambassadeur, avec nos équipes, nous avons :</w:t>
+      </w:r>
+      <w:r/>
+      <w:r/>
+    </w:p>
+    <w:p>
+      <w:pPr>
+        <w:pStyle w:val="ListBullet"/>
+        <w:spacing w:line="240" w:lineRule="auto"/>
+        <w:ind w:left="720"/>
+      </w:pPr>
+      <w:r/>
+      <w:r>
+        <w:t xml:space="preserve">noué des partenariats solides avec des médias internationaux comme </w:t>
       </w:r>
       <w:r>
-        <w:t>[Si c’est le cas : ce que vous avez fait comme ambassadeur, par exemple un film ou un débat sur ces thèmes.]</w:t>
+        <w:rPr>
+          <w:b/>
+        </w:rPr>
+        <w:t>TV5 Monde</w:t>
+      </w:r>
+      <w:r>
+        <w:t xml:space="preserve"> et </w:t>
+      </w:r>
+      <w:r>
+        <w:rPr>
+          <w:b/>
+        </w:rPr>
+        <w:t>Africa 24</w:t>
+      </w:r>
+      <w:r>
+        <w:t>, ainsi qu’avec des personnalités africaines ;</w:t>
+      </w:r>
+      <w:r/>
+    </w:p>
+    <w:p>
+      <w:pPr>
+        <w:pStyle w:val="ListBullet"/>
+        <w:spacing w:line="240" w:lineRule="auto"/>
+        <w:ind w:left="720"/>
+      </w:pPr>
+      <w:r/>
+      <w:r>
+        <w:t xml:space="preserve">élaboré un </w:t>
+      </w:r>
+      <w:r>
+        <w:rPr>
+          <w:b/>
+        </w:rPr>
+        <w:t>plan d’action sur cinq ans</w:t>
+      </w:r>
+      <w:r>
+        <w:t xml:space="preserve"> pour le festival ;</w:t>
+      </w:r>
+      <w:r/>
+    </w:p>
+    <w:p>
+      <w:pPr>
+        <w:pStyle w:val="ListBullet"/>
+        <w:spacing w:line="240" w:lineRule="auto"/>
+        <w:ind w:left="720"/>
+      </w:pPr>
+      <w:r/>
+      <w:r>
+        <w:t>fait former l’équipe de coordination par un spécialiste du domaine ;</w:t>
+      </w:r>
+      <w:r/>
+    </w:p>
+    <w:p>
+      <w:pPr>
+        <w:pStyle w:val="ListBullet"/>
+        <w:spacing w:line="240" w:lineRule="auto"/>
+        <w:ind w:left="720"/>
+      </w:pPr>
+      <w:r/>
+      <w:r>
+        <w:t>hébergé l’équipe de gestion du festival dans les locaux de Guinée Impact, de la 6ᵉ édition à aujourd’hui.</w:t>
+      </w:r>
+      <w:r/>
+      <w:r/>
+    </w:p>
+    <w:p>
+      <w:r/>
+      <w:r>
+        <w:t>C’est aussi cela, notre rôle de société civile : donner aux jeunes créateur·rices les moyens de durer, et faire entendre leurs histoires bien au-delà de la Guinée.</w:t>
       </w:r>
       <w:r/>
     </w:p>
@@ -2343,7 +2431,7 @@
           </w:tcPr>
           <w:p>
             <w:r>
-              <w:t>[À compléter : votre rôle, vos actions, par exemple la mobilisation du public, des partenaires ou des débats sur la paix et le genre]</w:t>
+              <w:t>Partenariats avec TV5 Monde, Africa 24 et des personnalités africaines ; plan d’action sur cinq ans ; formation de l’équipe de coordination par un spécialiste ; hébergement de l’équipe de gestion dans les locaux de Guinée Impact depuis la 6ᵉ édition.</w:t>
             </w:r>
           </w:p>
         </w:tc>

</xml_diff>

<commit_message>
Discours raccourci à 10 minutes, notes des diapositives synchronisées
Co-Authored-By: Claude Opus 5.5 <noreply@anthropic.com>
Claude-Session: https://claude.ai/code/session_01Y44voEEgrqkDtN5faKYhcF
</commit_message>
<xml_diff>
--- a/Communication_Guinee_Impact_Forum_Dakar_2026.docx
+++ b/Communication_Guinee_Impact_Forum_Dakar_2026.docx
@@ -130,7 +130,7 @@
           </w:tcPr>
           <w:p>
             <w:r>
-              <w:t>11 minutes environ, puis questions</w:t>
+              <w:t>10 minutes (environ 1 000 mots, avec une marge pour les pauses et les changements de diapositive), puis questions</w:t>
             </w:r>
           </w:p>
         </w:tc>
@@ -384,7 +384,7 @@
     <w:p>
       <w:r/>
       <w:r>
-        <w:t>Ouverture (1 minute)</w:t>
+        <w:t>Ouverture (45 secondes)</w:t>
       </w:r>
       <w:r/>
     </w:p>
@@ -414,7 +414,7 @@
     <w:p>
       <w:r/>
       <w:r>
-        <w:t>À Somone, lors de la première édition de ce forum, nous avons pris des engagements ensemble. Je suis venu à Dakar vous rendre compte de ce que Guinée Impact en a fait. Et je veux le dire d’emblée : rien de ce que je vais présenter n’aurait été possible sans nos équipes, nos collaborateur·rices, notre Directeur Exécutif, M. Racine Diallo, et surtout les femmes et les jeunes avec qui nous travaillons sur le terrain.</w:t>
+        <w:t>À Somone, nous avons pris des engagements ensemble. Je viens vous rendre compte de ce que nous en avons fait. Et je le dis d’emblée : rien de tout cela n’aurait été possible sans nos équipes, notre Directeur Exécutif, M. Racine Diallo, et surtout les femmes et les jeunes avec qui nous travaillons sur le terrain.</w:t>
       </w:r>
       <w:r/>
     </w:p>
@@ -428,14 +428,7 @@
     <w:p>
       <w:r/>
       <w:r>
-        <w:t>Guinée Impact est une plateforme de la société civile guinéenne, basée à Conakry. Notre mission : promouvoir une gouvernance responsable, renforcer la participation citoyenne et accompagner les initiatives qui favorisent la paix, l’inclusion sociale, le leadership et l’autonomisation des jeunes et des femmes. Nous travaillons avec les institutions publiques, les collectivités locales, la société civile, le secteur privé et les partenaires au développement.</w:t>
-      </w:r>
-      <w:r/>
-    </w:p>
-    <w:p>
-      <w:r/>
-      <w:r>
-        <w:t xml:space="preserve">Nous sommes membre du Groupe de Travail Femmes, Jeunes, Paix et Sécurité, et partenaire du projet </w:t>
+        <w:t xml:space="preserve">Guinée Impact est une plateforme de la société civile guinéenne, basée à Conakry. Notre mission : promouvoir une gouvernance responsable, la participation citoyenne, la paix, le leadership et l’autonomisation des jeunes et des femmes. Nous sommes partenaire du projet </w:t>
       </w:r>
       <w:r>
         <w:rPr>
@@ -444,21 +437,21 @@
         <w:t>Filles et Femmes Engagées pour la Construction de la Paix en Guinée</w:t>
       </w:r>
       <w:r>
-        <w:t xml:space="preserve"> (FIFEP), financé par le Fonds des Nations Unies pour la consolidation de la paix. Ce projet renforce les organisations de la société civile dirigées par des femmes pour qu’elles participent réellement aux processus de paix et de décision.</w:t>
+        <w:t xml:space="preserve"> (FIFEP), financé par le Fonds des Nations Unies pour la consolidation de la paix.</w:t>
       </w:r>
       <w:r/>
     </w:p>
     <w:p>
       <w:r/>
       <w:r>
-        <w:t>Notre parcours en dates (1 minute 30)</w:t>
+        <w:t>Notre parcours en dates (1 minute)</w:t>
       </w:r>
       <w:r/>
     </w:p>
     <w:p>
       <w:r/>
       <w:r>
-        <w:t>Avec notre Groupe de Travail et nos partenaires, voici le chemin parcouru :</w:t>
+        <w:t>Avec notre Groupe de Travail et nos partenaires :</w:t>
       </w:r>
       <w:r/>
       <w:r/>
@@ -474,10 +467,10 @@
         <w:rPr>
           <w:b/>
         </w:rPr>
-        <w:t>Juillet 2024, Conakry</w:t>
+        <w:t>Juillet 2024</w:t>
       </w:r>
       <w:r>
-        <w:t xml:space="preserve"> : nous validons les indicateurs d’une plateforme numérique de suivi de la participation des filles et des femmes aux mécanismes de paix, et nous formons 20 mouvements politiques et organisations de la société civile au civisme, à la médiation et à l’alerte précoce.</w:t>
+        <w:t xml:space="preserve"> : nous validons les indicateurs d’une plateforme numérique de suivi de la participation des filles et des femmes à la paix, et nous formons 20 mouvements politiques et organisations de la société civile à l’alerte précoce.</w:t>
       </w:r>
       <w:r/>
     </w:p>
@@ -495,7 +488,7 @@
         <w:t>Août 2024</w:t>
       </w:r>
       <w:r>
-        <w:t xml:space="preserve"> : une stratégie nationale de plaidoyer voit le jour, construite à partir des plans locaux de 11 zones du projet FIFEP.</w:t>
+        <w:t xml:space="preserve"> : une stratégie nationale de plaidoyer voit le jour, construite à partir des plans locaux de 11 zones.</w:t>
       </w:r>
       <w:r/>
     </w:p>
@@ -510,102 +503,19 @@
         <w:rPr>
           <w:b/>
         </w:rPr>
-        <w:t>2024, Accra</w:t>
+        <w:t>Fin 2024</w:t>
       </w:r>
       <w:r>
-        <w:t xml:space="preserve"> : nous partageons notre expérience à la réunion annuelle du Groupe de Travail sous-régional.</w:t>
+        <w:t xml:space="preserve"> : nous partageons notre expérience à Accra, avec le Groupe de Travail sous-régional, et nous renforçons notre partenariat avec CARE International.</w:t>
       </w:r>
+      <w:r/>
       <w:r/>
     </w:p>
     <w:p>
-      <w:pPr>
-        <w:pStyle w:val="ListBullet"/>
-        <w:spacing w:line="240" w:lineRule="auto"/>
-        <w:ind w:left="720"/>
-      </w:pPr>
       <w:r/>
       <w:r>
-        <w:rPr>
-          <w:b/>
-        </w:rPr>
-        <w:t>Octobre 2024</w:t>
+        <w:t>Puis viennent Mamou, le festival Les 7 Jours du 7ᵉ Art et Marrakech. Je vous les raconte.</w:t>
       </w:r>
-      <w:r>
-        <w:t xml:space="preserve"> : nous renforçons notre partenariat avec CARE International.</w:t>
-      </w:r>
-      <w:r/>
-    </w:p>
-    <w:p>
-      <w:pPr>
-        <w:pStyle w:val="ListBullet"/>
-        <w:spacing w:line="240" w:lineRule="auto"/>
-        <w:ind w:left="720"/>
-      </w:pPr>
-      <w:r/>
-      <w:r>
-        <w:rPr>
-          <w:b/>
-        </w:rPr>
-        <w:t>Décembre 2024, Conakry</w:t>
-      </w:r>
-      <w:r>
-        <w:t xml:space="preserve"> : je suis ambassadeur de la 6ᵉ édition du festival de cinéma Les 7 Jours du 7ᵉ Art.</w:t>
-      </w:r>
-      <w:r/>
-    </w:p>
-    <w:p>
-      <w:pPr>
-        <w:pStyle w:val="ListBullet"/>
-        <w:spacing w:line="240" w:lineRule="auto"/>
-        <w:ind w:left="720"/>
-      </w:pPr>
-      <w:r/>
-      <w:r>
-        <w:rPr>
-          <w:b/>
-        </w:rPr>
-        <w:t>Janvier 2025, Mamou</w:t>
-      </w:r>
-      <w:r>
-        <w:t xml:space="preserve"> : nous portons la stratégie nationale de plaidoyer jusqu’aux communautés.</w:t>
-      </w:r>
-      <w:r/>
-    </w:p>
-    <w:p>
-      <w:pPr>
-        <w:pStyle w:val="ListBullet"/>
-        <w:spacing w:line="240" w:lineRule="auto"/>
-        <w:ind w:left="720"/>
-      </w:pPr>
-      <w:r/>
-      <w:r>
-        <w:rPr>
-          <w:b/>
-        </w:rPr>
-        <w:t>19 et 20 juin 2025, Marrakech</w:t>
-      </w:r>
-      <w:r>
-        <w:t xml:space="preserve"> : au premier Youth Empowerment Summit – YES Africa, je suis distingué « Champion de la jeunesse africaine » sur le droit des jeunes et leur implication dans les instances de prise de décision.</w:t>
-      </w:r>
-      <w:r/>
-    </w:p>
-    <w:p>
-      <w:pPr>
-        <w:pStyle w:val="ListBullet"/>
-        <w:spacing w:line="240" w:lineRule="auto"/>
-        <w:ind w:left="720"/>
-      </w:pPr>
-      <w:r/>
-      <w:r>
-        <w:rPr>
-          <w:b/>
-        </w:rPr>
-        <w:t>Aujourd’hui, Dakar</w:t>
-      </w:r>
-      <w:r>
-        <w:t xml:space="preserve"> : nous venons partager nos leçons avec vous.</w:t>
-      </w:r>
-      <w:r/>
       <w:r/>
     </w:p>
     <w:p>
@@ -618,7 +528,7 @@
     <w:p>
       <w:r/>
       <w:r>
-        <w:t>En 2024, notre Groupe de Travail et ses partenaires ont élaboré une stratégie nationale de plaidoyer pour la participation des filles et des femmes à la prévention et à la résolution des conflits. Mais une stratégie ne change rien si elle reste dans un bureau. Du 16 au 20 janvier 2025, à Mamou, nos équipes l’ont portée jusqu’aux communautés, avec cinq formats différents :</w:t>
+        <w:t>Une stratégie ne change rien si elle reste dans un bureau. Du 16 au 20 janvier 2025, à Mamou, nos équipes l’ont portée jusqu’aux communautés, avec cinq formats :</w:t>
       </w:r>
       <w:r/>
       <w:r/>
@@ -637,7 +547,7 @@
         <w:t>La radio</w:t>
       </w:r>
       <w:r>
-        <w:t xml:space="preserve"> : une émission interactive de deux heures, en direct, avec des femmes leaders, des organisations de la société civile et de jeunes activistes.</w:t>
+        <w:t xml:space="preserve"> : une émission interactive de deux heures, en direct, avec des femmes leaders et de jeunes activistes.</w:t>
       </w:r>
       <w:r/>
     </w:p>
@@ -673,7 +583,7 @@
         <w:t>Le lieu de culte</w:t>
       </w:r>
       <w:r>
-        <w:t xml:space="preserve"> : un dialogue communautaire de 50 personnes, mené avec les leaders religieux et communautaires, sur les résolutions 1325 et 2250 et sur les mutilations génitales féminines.</w:t>
+        <w:t xml:space="preserve"> : un dialogue de 50 personnes, mené avec les leaders religieux et communautaires, sur les résolutions 1325 et 2250 et sur les mutilations génitales féminines.</w:t>
       </w:r>
       <w:r/>
     </w:p>
@@ -691,7 +601,7 @@
         <w:t>La scène</w:t>
       </w:r>
       <w:r>
-        <w:t xml:space="preserve"> : une soirée culturelle avec du théâtre en langue locale, devant plus de 100 personnes.</w:t>
+        <w:t xml:space="preserve"> : du théâtre en langue locale, devant plus de 100 personnes.</w:t>
       </w:r>
       <w:r/>
     </w:p>
@@ -731,7 +641,7 @@
     <w:p>
       <w:r/>
       <w:r>
-        <w:t xml:space="preserve">Les 19 et 20 juin 2025, à Marrakech, s’est tenu le premier </w:t>
+        <w:t xml:space="preserve">En juin 2025, à Marrakech, s’est tenu le premier </w:t>
       </w:r>
       <w:r>
         <w:rPr>
@@ -740,51 +650,51 @@
         <w:t>Youth Empowerment Summit – YES Africa</w:t>
       </w:r>
       <w:r>
-        <w:t>, co-organisé par la Fondation Jadara et l’Union Panafricaine de la Jeunesse. Plus de 1 000 jeunes leaders et représentant·es de 118 ONG de 43 pays africains y ont travaillé sur l’avenir de la jeunesse africaine, en particulier des jeunes sans emploi, hors de l’école ou sans formation. C’est dans ce cadre que j’ai été distingué « Champion de la jeunesse africaine sur le droit des jeunes et leur implication dans les instances de prise de décision ».</w:t>
+        <w:t xml:space="preserve"> : plus de 1 000 jeunes leaders, 118 ONG, 43 pays africains. J’y ai été distingué </w:t>
+      </w:r>
+      <w:r>
+        <w:rPr>
+          <w:b/>
+        </w:rPr>
+        <w:t>« Champion de la jeunesse africaine sur le droit des jeunes et leur implication dans les instances de prise de décision »</w:t>
+      </w:r>
+      <w:r>
+        <w:t>.</w:t>
       </w:r>
       <w:r/>
     </w:p>
     <w:p>
       <w:r/>
       <w:r>
-        <w:t xml:space="preserve">J’y ai aussi pris la parole comme intervenant de la conférence </w:t>
-      </w:r>
-      <w:r>
-        <w:rPr>
-          <w:i/>
-        </w:rPr>
-        <w:t>« Cultiver la résilience face au changement climatique : l’agriculture et l’agroalimentaire, piliers de la sécurité alimentaire et leviers d’innovation pour la jeunesse africaine »</w:t>
-      </w:r>
-      <w:r>
-        <w:t>, aux côtés d’expert·es du Malawi, du Maroc et du Bénin, en tant que leader de l’agroécologie et de l’autonomisation des jeunes. Ce n’est pas un sujet éloigné du nôtre : quand la terre s’épuise et que les récoltes manquent, les tensions montent, et ce sont souvent les femmes et les jeunes qui en paient le prix. La sécurité alimentaire fait partie de la paix.</w:t>
+        <w:t>J’y suis aussi intervenu sur la résilience climatique, l’agriculture et la sécurité alimentaire, en tant que leader de l’agroécologie et de l’autonomisation des jeunes. Ce n’est pas loin de notre sujet : quand les récoltes manquent, les tensions montent, et ce sont souvent les femmes et les jeunes qui en paient le prix. La sécurité alimentaire fait partie de la paix.</w:t>
       </w:r>
       <w:r/>
     </w:p>
     <w:p>
       <w:r/>
       <w:r>
-        <w:t>Ce titre a un sens particulier ici. À Somone, nous avons demandé une participation significative des jeunes dans les instances de décision et l’autonomisation des conseils nationaux de jeunesse. Cette distinction montre que ce combat est entendu à l’échelle du continent. Mais un titre ne suffit pas : ce qui compte, c’est que les jeunes, et en particulier les jeunes femmes, siègent réellement là où les décisions se prennent.</w:t>
+        <w:t>À Somone, nous avons demandé que les jeunes participent vraiment aux décisions. Ce titre montre que ce combat est entendu à l’échelle du continent. Mais un titre ne suffit pas : ce qui compte, c’est que les jeunes, et en particulier les jeunes femmes, siègent réellement là où les décisions se prennent.</w:t>
       </w:r>
       <w:r/>
     </w:p>
     <w:p>
       <w:r/>
       <w:r>
-        <w:t>J’ai eu l’honneur de recevoir ce titre, mais il ne m’appartient pas. Il appartient à nos équipes, qui ont travaillé souvent avec peu de moyens. Il appartient aux femmes leaders de Mamou qui ont pris la parole, aux leaders religieux qui ont accepté d’ouvrir le dialogue, et aux jeunes qui se sont engagé·es. Il montre surtout qu’une organisation guinéenne de terrain peut être reconnue à l’échelle du continent. Et Marrakech nous a rappelé une chose : il n’y a pas de paix durable pour les femmes et les jeunes sans autonomie économique, un point que nos collègues avaient déjà soulevé à Somone. Et c’est un message pour chacune et chacun d’entre vous : votre travail compte, et il peut être vu.</w:t>
+        <w:t>Ce titre ne m’appartient pas. Il appartient à nos équipes, aux femmes leaders de Mamou, aux leaders religieux qui ont ouvert le dialogue, et aux jeunes qui se sont engagé·es. Et il dit à chacune et chacun d’entre vous : votre travail compte, et il peut être vu.</w:t>
       </w:r>
       <w:r/>
     </w:p>
     <w:p>
       <w:r/>
       <w:r>
-        <w:t>La culture au service de la paix : le cinéma (1 minute 30)</w:t>
+        <w:t>La culture au service de la paix : le cinéma (1 minute 15)</w:t>
       </w:r>
       <w:r/>
     </w:p>
     <w:p>
       <w:r/>
       <w:r>
-        <w:t xml:space="preserve">J’ai également été ambassadeur de la 6ᵉ édition du festival </w:t>
+        <w:t xml:space="preserve">Depuis la 6ᵉ édition, en décembre 2024, je suis ambassadeur du festival </w:t>
       </w:r>
       <w:r>
         <w:rPr>
@@ -793,34 +703,21 @@
         <w:t>Les 7 Jours du 7ᵉ Art</w:t>
       </w:r>
       <w:r>
-        <w:t>, en décembre 2024. Chaque année en décembre, à Conakry, ce festival fait vivre le cinéma guinéen et ouvre aux jeunes cinéastes des occasions de se former, de diffuser leurs films et de coproduire. Sa 7ᵉ édition, du 6 au 12 décembre 2025, avait pour thème « L’Encre et l’Écran » et a reçu plus de 315 films venus d’Afrique, d’Europe, d’Asie, d’Amérique et du Moyen-Orient.</w:t>
+        <w:t>, qui fait vivre chaque année à Conakry le cinéma guinéen et ouvre des portes aux jeunes cinéastes.</w:t>
       </w:r>
       <w:r/>
     </w:p>
     <w:p>
       <w:r/>
       <w:r>
-        <w:t>Pourquoi un défenseur de la paix s’engage-t-il dans un festival de cinéma ? Parce qu’à Mamou, nous avons vu qu’une pièce de théâtre en langue locale touche plus de monde qu’un long discours. Le cinéma, c’est la même force, avec une portée encore plus grande. Les projections en plein air, les débats et les ateliers du festival sont des espaces où l’on peut parler des droits des femmes, des violences et de la paix avec le grand public, et surtout avec les jeunes.</w:t>
+        <w:t>Pourquoi un défenseur de la paix s’engage-t-il dans un festival de cinéma ? Parce qu’à Mamou, une pièce de théâtre en langue locale a touché plus de monde qu’un long discours. Le cinéma a la même force, avec une portée plus grande.</w:t>
       </w:r>
       <w:r/>
     </w:p>
     <w:p>
       <w:r/>
       <w:r>
-        <w:t>Comme ambassadeur, avec nos équipes, nous avons :</w:t>
-      </w:r>
-      <w:r/>
-      <w:r/>
-    </w:p>
-    <w:p>
-      <w:pPr>
-        <w:pStyle w:val="ListBullet"/>
-        <w:spacing w:line="240" w:lineRule="auto"/>
-        <w:ind w:left="720"/>
-      </w:pPr>
-      <w:r/>
-      <w:r>
-        <w:t xml:space="preserve">noué des partenariats solides avec des médias internationaux comme </w:t>
+        <w:t xml:space="preserve">Avec nos équipes, nous avons noué des partenariats avec </w:t>
       </w:r>
       <w:r>
         <w:rPr>
@@ -829,7 +726,7 @@
         <w:t>TV5 Monde</w:t>
       </w:r>
       <w:r>
-        <w:t xml:space="preserve"> et </w:t>
+        <w:t xml:space="preserve">, </w:t>
       </w:r>
       <w:r>
         <w:rPr>
@@ -838,19 +735,7 @@
         <w:t>Africa 24</w:t>
       </w:r>
       <w:r>
-        <w:t>, ainsi qu’avec des personnalités africaines ;</w:t>
-      </w:r>
-      <w:r/>
-    </w:p>
-    <w:p>
-      <w:pPr>
-        <w:pStyle w:val="ListBullet"/>
-        <w:spacing w:line="240" w:lineRule="auto"/>
-        <w:ind w:left="720"/>
-      </w:pPr>
-      <w:r/>
-      <w:r>
-        <w:t xml:space="preserve">élaboré un </w:t>
+        <w:t xml:space="preserve"> et des personnalités africaines ; élaboré un </w:t>
       </w:r>
       <w:r>
         <w:rPr>
@@ -859,46 +744,14 @@
         <w:t>plan d’action sur cinq ans</w:t>
       </w:r>
       <w:r>
-        <w:t xml:space="preserve"> pour le festival ;</w:t>
-      </w:r>
-      <w:r/>
-    </w:p>
-    <w:p>
-      <w:pPr>
-        <w:pStyle w:val="ListBullet"/>
-        <w:spacing w:line="240" w:lineRule="auto"/>
-        <w:ind w:left="720"/>
-      </w:pPr>
-      <w:r/>
-      <w:r>
-        <w:t>fait former l’équipe de coordination par un spécialiste du domaine ;</w:t>
-      </w:r>
-      <w:r/>
-    </w:p>
-    <w:p>
-      <w:pPr>
-        <w:pStyle w:val="ListBullet"/>
-        <w:spacing w:line="240" w:lineRule="auto"/>
-        <w:ind w:left="720"/>
-      </w:pPr>
-      <w:r/>
-      <w:r>
-        <w:t>hébergé l’équipe de gestion du festival dans les locaux de Guinée Impact, de la 6ᵉ édition à aujourd’hui.</w:t>
-      </w:r>
-      <w:r/>
-      <w:r/>
-    </w:p>
-    <w:p>
-      <w:r/>
-      <w:r>
-        <w:t>C’est aussi cela, notre rôle de société civile : donner aux jeunes créateur·rices les moyens de durer, et faire entendre leurs histoires bien au-delà de la Guinée.</w:t>
+        <w:t xml:space="preserve"> ; fait former l’équipe de coordination par un spécialiste ; et nous hébergeons l’équipe de gestion du festival dans nos locaux. Notre rôle de société civile, c’est aussi de donner aux jeunes créateur·rices les moyens de durer.</w:t>
       </w:r>
       <w:r/>
     </w:p>
     <w:p>
       <w:r/>
       <w:r>
-        <w:t>Ce que nous avons appris (1 minute)</w:t>
+        <w:t>Ce que nous avons appris (45 secondes)</w:t>
       </w:r>
       <w:r/>
     </w:p>
@@ -911,7 +764,7 @@
         <w:t>Les résistances se lèvent par le dialogue.</w:t>
       </w:r>
       <w:r>
-        <w:t xml:space="preserve"> Au début, certaines personnes ont résisté aux messages, en particulier sur les MGF. Nous n’avons pas imposé : nous avons discuté, et lorsque les leaders religieux ont pris la parole eux-mêmes, le message a été reçu autrement.</w:t>
+        <w:t xml:space="preserve"> Sur les MGF, nous n’avons pas imposé : nous avons discuté, et quand les leaders religieux ont pris la parole, le message a été reçu autrement.</w:t>
       </w:r>
       <w:r/>
     </w:p>
@@ -924,7 +777,7 @@
         <w:t>La culture est un outil de plaidoyer.</w:t>
       </w:r>
       <w:r>
-        <w:t xml:space="preserve"> Théâtre ou cinéma : une histoire bien racontée explique la résolution 1325 mieux qu’un long discours.</w:t>
+        <w:t xml:space="preserve"> Une histoire bien racontée explique la résolution 1325 mieux qu’un long discours.</w:t>
       </w:r>
       <w:r/>
     </w:p>
@@ -937,21 +790,21 @@
         <w:t>Les générations ont besoin l’une de l’autre.</w:t>
       </w:r>
       <w:r>
-        <w:t xml:space="preserve"> Les femmes leaders apportent l’expérience ; les jeunes apportent l’énergie et de nouveaux outils.</w:t>
+        <w:t xml:space="preserve"> Les femmes leaders apportent l’expérience ; les jeunes, l’énergie et de nouveaux outils.</w:t>
       </w:r>
       <w:r/>
     </w:p>
     <w:p>
       <w:r/>
       <w:r>
-        <w:t>Ce qui nous freine (30 secondes)</w:t>
+        <w:t>Ce qui nous freine (20 secondes)</w:t>
       </w:r>
       <w:r/>
     </w:p>
     <w:p>
       <w:r/>
       <w:r>
-        <w:t>Nous restons lucides : la mobilisation des participant·es est difficile, la logistique coûte cher, nos activités dépendent de financements par projet, et nous devons encore mieux mesurer le changement réel dans les attitudes et les comportements.</w:t>
+        <w:t>Nous restons lucides : mobiliser coûte cher, nos activités dépendent de financements par projet, et nous devons mieux mesurer le changement réel des attitudes.</w:t>
       </w:r>
       <w:r/>
     </w:p>
@@ -977,7 +830,7 @@
         <w:t>Reproduire le modèle « cinq formats »</w:t>
       </w:r>
       <w:r>
-        <w:t xml:space="preserve"> dans la campagne régionale sur les violences faites aux femmes et aux filles décidée à Somone.</w:t>
+        <w:t xml:space="preserve"> dans la campagne régionale contre les violences faites aux femmes et aux filles.</w:t>
       </w:r>
       <w:r/>
     </w:p>
@@ -995,7 +848,7 @@
         <w:t>Associer les leaders religieux et communautaires</w:t>
       </w:r>
       <w:r>
-        <w:t xml:space="preserve"> aux campagnes sur les VBG et les MGF dans chaque pays du réseau.</w:t>
+        <w:t xml:space="preserve"> aux campagnes sur les VBG et les MGF.</w:t>
       </w:r>
       <w:r/>
     </w:p>
@@ -1010,10 +863,10 @@
         <w:rPr>
           <w:b/>
         </w:rPr>
-        <w:t>Construire ensemble des indicateurs communs</w:t>
+        <w:t>Construire des indicateurs communs</w:t>
       </w:r>
       <w:r>
-        <w:t xml:space="preserve"> pour mesurer le changement d’attitude, pas seulement la participation.</w:t>
+        <w:t xml:space="preserve"> pour mesurer le changement d’attitude.</w:t>
       </w:r>
       <w:r/>
     </w:p>
@@ -1025,7 +878,7 @@
       </w:pPr>
       <w:r/>
       <w:r>
-        <w:t xml:space="preserve">Demander aux partenaires, dont ONU Femmes, des </w:t>
+        <w:t xml:space="preserve">Obtenir des partenaires, dont ONU Femmes, des </w:t>
       </w:r>
       <w:r>
         <w:rPr>
@@ -1034,7 +887,28 @@
         <w:t>financements pluriannuels</w:t>
       </w:r>
       <w:r>
-        <w:t xml:space="preserve"> pour les organisations locales de femmes et de jeunes.</w:t>
+        <w:t xml:space="preserve"> pour les organisations locales.</w:t>
+      </w:r>
+      <w:r/>
+    </w:p>
+    <w:p>
+      <w:pPr>
+        <w:pStyle w:val="ListNumber"/>
+        <w:spacing w:line="240" w:lineRule="auto"/>
+        <w:ind w:left="720"/>
+      </w:pPr>
+      <w:r/>
+      <w:r>
+        <w:t xml:space="preserve">Organiser des </w:t>
+      </w:r>
+      <w:r>
+        <w:rPr>
+          <w:b/>
+        </w:rPr>
+        <w:t>ciné-débats</w:t>
+      </w:r>
+      <w:r>
+        <w:t xml:space="preserve"> sur les résolutions 1325 et 2250 avec les festivals de la région.</w:t>
       </w:r>
       <w:r/>
     </w:p>
@@ -1049,28 +923,10 @@
         <w:rPr>
           <w:b/>
         </w:rPr>
-        <w:t>Utiliser l’art et le cinéma</w:t>
+        <w:t>Relier notre réseau</w:t>
       </w:r>
       <w:r>
-        <w:t xml:space="preserve"> : organiser, avec les festivals de la région comme Les 7 Jours du 7ᵉ Art, des ciné-débats sur les résolutions 1325 et 2250 et sur les violences faites aux femmes et aux filles, dans le cadre de la campagne régionale.</w:t>
-      </w:r>
-      <w:r/>
-    </w:p>
-    <w:p>
-      <w:pPr>
-        <w:pStyle w:val="ListNumber"/>
-        <w:spacing w:line="240" w:lineRule="auto"/>
-        <w:ind w:left="720"/>
-      </w:pPr>
-      <w:r/>
-      <w:r>
-        <w:rPr>
-          <w:b/>
-        </w:rPr>
-        <w:t>Relier les agendas</w:t>
-      </w:r>
-      <w:r>
-        <w:t xml:space="preserve"> : faire le lien entre notre réseau Femmes, Jeunes, Paix et Sécurité et les réseaux panafricains d’autonomisation des jeunes, comme YES Africa, pour que l’autonomie économique des jeunes femmes fasse partie de nos stratégies de paix.</w:t>
+        <w:t xml:space="preserve"> aux réseaux panafricains d’autonomisation des jeunes, comme YES Africa.</w:t>
       </w:r>
       <w:r/>
       <w:r/>
@@ -1085,7 +941,7 @@
     <w:p>
       <w:r/>
       <w:r>
-        <w:t>À Somone, nous avons dit que la politique est façonnée par celles et ceux qui s’engagent. Depuis, à Mamou, à Marrakech et sur les écrans de Conakry, nous avons appris que l’engagement finit toujours par être vu, et que l’art aide à le faire entendre. Nos voix, notre paix : continuons à les porter ensemble, jusqu’au dernier village.</w:t>
+        <w:t>À Somone, nous avons dit que la politique est façonnée par celles et ceux qui s’engagent. Depuis, à Mamou, à Marrakech et sur les écrans de Conakry, nous avons appris que l’engagement finit toujours par être vu. Nos voix, notre paix : continuons à les porter ensemble, jusqu’au dernier village.</w:t>
       </w:r>
       <w:r/>
     </w:p>

</xml_diff>